<commit_message>
updated docu with figures + prompts
</commit_message>
<xml_diff>
--- a/gf_c2_receipt_data_ocr/docs/challenge2_documentation.docx
+++ b/gf_c2_receipt_data_ocr/docs/challenge2_documentation.docx
@@ -191,23 +191,7 @@
           <w:rFonts w:eastAsia="Calibri" w:cs="Calibri"/>
           <w:szCs w:val="22"/>
         </w:rPr>
-        <w:t xml:space="preserve"> and makes that information </w:t>
-      </w:r>
-      <w:proofErr w:type="spellStart"/>
-      <w:r>
-        <w:rPr>
-          <w:rFonts w:eastAsia="Calibri" w:cs="Calibri"/>
-          <w:szCs w:val="22"/>
-        </w:rPr>
-        <w:t>queryable</w:t>
-      </w:r>
-      <w:proofErr w:type="spellEnd"/>
-      <w:r>
-        <w:rPr>
-          <w:rFonts w:eastAsia="Calibri" w:cs="Calibri"/>
-          <w:szCs w:val="22"/>
-        </w:rPr>
-        <w:t xml:space="preserve"> through a simple interface.</w:t>
+        <w:t xml:space="preserve"> and makes that information queryable through a simple interface.</w:t>
       </w:r>
       <w:r>
         <w:rPr>
@@ -570,6 +554,10 @@
     <w:p>
       <w:pPr>
         <w:spacing w:line="276" w:lineRule="auto"/>
+        <w:rPr>
+          <w:rFonts w:eastAsia="Calibri" w:cs="Calibri"/>
+          <w:szCs w:val="22"/>
+        </w:rPr>
       </w:pPr>
       <w:r>
         <w:rPr>
@@ -673,6 +661,11 @@
     <w:p>
       <w:pPr>
         <w:spacing w:line="276" w:lineRule="auto"/>
+      </w:pPr>
+    </w:p>
+    <w:p>
+      <w:pPr>
+        <w:spacing w:line="276" w:lineRule="auto"/>
         <w:rPr>
           <w:rFonts w:eastAsia="Calibri" w:cs="Calibri"/>
           <w:color w:val="EE0000"/>
@@ -682,58 +675,56 @@
       <w:r>
         <w:rPr>
           <w:rFonts w:eastAsia="Calibri" w:cs="Calibri"/>
+          <w:noProof/>
           <w:color w:val="EE0000"/>
           <w:szCs w:val="22"/>
         </w:rPr>
-        <w:t>//</w:t>
-      </w:r>
-      <w:r>
-        <w:rPr>
-          <w:rFonts w:eastAsia="Calibri" w:cs="Calibri"/>
-          <w:color w:val="EE0000"/>
-          <w:szCs w:val="22"/>
-        </w:rPr>
-        <w:t>i</w:t>
-      </w:r>
-      <w:r>
-        <w:rPr>
-          <w:rFonts w:eastAsia="Calibri" w:cs="Calibri"/>
-          <w:color w:val="EE0000"/>
-          <w:szCs w:val="22"/>
-        </w:rPr>
-        <w:t xml:space="preserve">nsert </w:t>
-      </w:r>
-      <w:r>
-        <w:rPr>
-          <w:rFonts w:eastAsia="Calibri" w:cs="Calibri"/>
-          <w:color w:val="EE0000"/>
-          <w:szCs w:val="22"/>
-        </w:rPr>
-        <w:t>s</w:t>
-      </w:r>
-      <w:r>
-        <w:rPr>
-          <w:rFonts w:eastAsia="Calibri" w:cs="Calibri"/>
-          <w:color w:val="EE0000"/>
-          <w:szCs w:val="22"/>
-        </w:rPr>
-        <w:t xml:space="preserve">ystem </w:t>
-      </w:r>
-      <w:r>
-        <w:rPr>
-          <w:rFonts w:eastAsia="Calibri" w:cs="Calibri"/>
-          <w:color w:val="EE0000"/>
-          <w:szCs w:val="22"/>
-        </w:rPr>
-        <w:t>d</w:t>
-      </w:r>
-      <w:r>
-        <w:rPr>
-          <w:rFonts w:eastAsia="Calibri" w:cs="Calibri"/>
-          <w:color w:val="EE0000"/>
-          <w:szCs w:val="22"/>
-        </w:rPr>
-        <w:t>iagram</w:t>
+        <w:lastRenderedPageBreak/>
+        <w:drawing>
+          <wp:inline distT="0" distB="0" distL="0" distR="0" wp14:anchorId="106AE093" wp14:editId="114A6792">
+            <wp:extent cx="5908675" cy="1154300"/>
+            <wp:effectExtent l="0" t="0" r="0" b="8255"/>
+            <wp:docPr id="2013623961" name="Picture 3"/>
+            <wp:cNvGraphicFramePr>
+              <a:graphicFrameLocks xmlns:a="http://schemas.openxmlformats.org/drawingml/2006/main" noChangeAspect="1"/>
+            </wp:cNvGraphicFramePr>
+            <a:graphic xmlns:a="http://schemas.openxmlformats.org/drawingml/2006/main">
+              <a:graphicData uri="http://schemas.openxmlformats.org/drawingml/2006/picture">
+                <pic:pic xmlns:pic="http://schemas.openxmlformats.org/drawingml/2006/picture">
+                  <pic:nvPicPr>
+                    <pic:cNvPr id="0" name="Picture 4"/>
+                    <pic:cNvPicPr>
+                      <a:picLocks noChangeAspect="1" noChangeArrowheads="1"/>
+                    </pic:cNvPicPr>
+                  </pic:nvPicPr>
+                  <pic:blipFill>
+                    <a:blip r:embed="rId5" cstate="print">
+                      <a:extLst>
+                        <a:ext uri="{28A0092B-C50C-407E-A947-70E740481C1C}">
+                          <a14:useLocalDpi xmlns:a14="http://schemas.microsoft.com/office/drawing/2010/main" val="0"/>
+                        </a:ext>
+                      </a:extLst>
+                    </a:blip>
+                    <a:srcRect/>
+                    <a:stretch>
+                      <a:fillRect/>
+                    </a:stretch>
+                  </pic:blipFill>
+                  <pic:spPr bwMode="auto">
+                    <a:xfrm>
+                      <a:off x="0" y="0"/>
+                      <a:ext cx="5955272" cy="1163403"/>
+                    </a:xfrm>
+                    <a:prstGeom prst="rect">
+                      <a:avLst/>
+                    </a:prstGeom>
+                    <a:noFill/>
+                  </pic:spPr>
+                </pic:pic>
+              </a:graphicData>
+            </a:graphic>
+          </wp:inline>
+        </w:drawing>
       </w:r>
     </w:p>
     <w:p>
@@ -760,7 +751,7 @@
           <w:sz w:val="20"/>
           <w:szCs w:val="20"/>
         </w:rPr>
-        <w:t>2</w:t>
+        <w:t>1</w:t>
       </w:r>
       <w:r>
         <w:rPr>
@@ -840,7 +831,6 @@
         <w:pStyle w:val="Heading1"/>
       </w:pPr>
       <w:r>
-        <w:lastRenderedPageBreak/>
         <w:t>3. Assumptions &amp; Limitations</w:t>
       </w:r>
     </w:p>
@@ -995,43 +985,14 @@
       <w:r>
         <w:t xml:space="preserve">: </w:t>
       </w:r>
-      <w:proofErr w:type="spellStart"/>
-      <w:r>
-        <w:t>moondream</w:t>
-      </w:r>
-      <w:proofErr w:type="spellEnd"/>
-      <w:r>
-        <w:t xml:space="preserve"> is used in place of </w:t>
-      </w:r>
-      <w:proofErr w:type="spellStart"/>
-      <w:r>
-        <w:t>llava</w:t>
-      </w:r>
-      <w:proofErr w:type="spellEnd"/>
-      <w:r>
-        <w:t xml:space="preserve"> as the vision</w:t>
+      <w:r>
+        <w:t>moondream is used in place of llava as the vision</w:t>
       </w:r>
       <w:r>
         <w:t>-</w:t>
       </w:r>
       <w:r>
-        <w:t xml:space="preserve">language model. </w:t>
-      </w:r>
-      <w:proofErr w:type="spellStart"/>
-      <w:r>
-        <w:t>llava</w:t>
-      </w:r>
-      <w:proofErr w:type="spellEnd"/>
-      <w:r>
-        <w:t xml:space="preserve"> was the original choice; </w:t>
-      </w:r>
-      <w:proofErr w:type="spellStart"/>
-      <w:r>
-        <w:t>moondream</w:t>
-      </w:r>
-      <w:proofErr w:type="spellEnd"/>
-      <w:r>
-        <w:t xml:space="preserve"> was substituted for its smaller footprint and faster CPU inference, at some cost to transcription accuracy relative to a larger vision model.</w:t>
+        <w:t>language model. llava was the original choice; moondream was substituted for its smaller footprint and faster CPU inference, at some cost to transcription accuracy relative to a larger vision model.</w:t>
       </w:r>
     </w:p>
     <w:p>
@@ -1170,6 +1131,7 @@
         <w:pStyle w:val="Heading1"/>
       </w:pPr>
       <w:r>
+        <w:lastRenderedPageBreak/>
         <w:t>4. Methodology</w:t>
       </w:r>
     </w:p>
@@ -1277,7 +1239,6 @@
           <w:b/>
           <w:bCs/>
         </w:rPr>
-        <w:lastRenderedPageBreak/>
         <w:t>Normalize</w:t>
       </w:r>
       <w:r>
@@ -1401,7 +1362,6 @@
             <w:shd w:val="clear" w:color="auto" w:fill="D0CECE" w:themeFill="background2" w:themeFillShade="E6"/>
           </w:tcPr>
           <w:p>
-            <w:proofErr w:type="spellStart"/>
             <w:r>
               <w:rPr>
                 <w:rFonts w:eastAsia="Calibri" w:cs="Calibri"/>
@@ -1410,7 +1370,6 @@
               </w:rPr>
               <w:t>EasyOCR</w:t>
             </w:r>
-            <w:proofErr w:type="spellEnd"/>
           </w:p>
         </w:tc>
         <w:tc>
@@ -1452,7 +1411,6 @@
             <w:shd w:val="clear" w:color="auto" w:fill="D0CECE" w:themeFill="background2" w:themeFillShade="E6"/>
           </w:tcPr>
           <w:p>
-            <w:proofErr w:type="spellStart"/>
             <w:r>
               <w:rPr>
                 <w:rFonts w:eastAsia="Calibri" w:cs="Calibri"/>
@@ -1461,7 +1419,6 @@
               </w:rPr>
               <w:t>Ollama</w:t>
             </w:r>
-            <w:proofErr w:type="spellEnd"/>
           </w:p>
         </w:tc>
         <w:tc>
@@ -1519,7 +1476,6 @@
             <w:shd w:val="clear" w:color="auto" w:fill="D0CECE" w:themeFill="background2" w:themeFillShade="E6"/>
           </w:tcPr>
           <w:p>
-            <w:proofErr w:type="spellStart"/>
             <w:r>
               <w:rPr>
                 <w:rFonts w:eastAsia="Calibri" w:cs="Calibri"/>
@@ -1528,7 +1484,6 @@
               </w:rPr>
               <w:t>moondream</w:t>
             </w:r>
-            <w:proofErr w:type="spellEnd"/>
           </w:p>
         </w:tc>
         <w:tc>
@@ -1641,25 +1596,7 @@
                 <w:sz w:val="20"/>
                 <w:szCs w:val="20"/>
               </w:rPr>
-              <w:t xml:space="preserve"> for entity extraction, rectification, and completion, and for the </w:t>
-            </w:r>
-            <w:proofErr w:type="spellStart"/>
-            <w:r>
-              <w:rPr>
-                <w:rFonts w:eastAsia="Calibri" w:cs="Calibri"/>
-                <w:sz w:val="20"/>
-                <w:szCs w:val="20"/>
-              </w:rPr>
-              <w:t>Gradio</w:t>
-            </w:r>
-            <w:proofErr w:type="spellEnd"/>
-            <w:r>
-              <w:rPr>
-                <w:rFonts w:eastAsia="Calibri" w:cs="Calibri"/>
-                <w:sz w:val="20"/>
-                <w:szCs w:val="20"/>
-              </w:rPr>
-              <w:t xml:space="preserve"> app's Q&amp;A responses.</w:t>
+              <w:t xml:space="preserve"> for entity extraction, rectification, and completion, and for the Gradio app's Q&amp;A responses.</w:t>
             </w:r>
           </w:p>
         </w:tc>
@@ -1671,7 +1608,6 @@
             <w:shd w:val="clear" w:color="auto" w:fill="D0CECE" w:themeFill="background2" w:themeFillShade="E6"/>
           </w:tcPr>
           <w:p>
-            <w:proofErr w:type="spellStart"/>
             <w:r>
               <w:rPr>
                 <w:rFonts w:eastAsia="Calibri" w:cs="Calibri"/>
@@ -1680,7 +1616,6 @@
               </w:rPr>
               <w:t>Gradio</w:t>
             </w:r>
-            <w:proofErr w:type="spellEnd"/>
           </w:p>
         </w:tc>
         <w:tc>
@@ -1925,7 +1860,6 @@
                 <w:szCs w:val="22"/>
               </w:rPr>
             </w:pPr>
-            <w:proofErr w:type="spellStart"/>
             <w:r>
               <w:rPr>
                 <w:sz w:val="20"/>
@@ -1933,7 +1867,6 @@
               </w:rPr>
               <w:t>EasyOCR</w:t>
             </w:r>
-            <w:proofErr w:type="spellEnd"/>
           </w:p>
         </w:tc>
         <w:tc>
@@ -2031,7 +1964,6 @@
                 <w:szCs w:val="22"/>
               </w:rPr>
             </w:pPr>
-            <w:proofErr w:type="spellStart"/>
             <w:r>
               <w:rPr>
                 <w:sz w:val="20"/>
@@ -2039,7 +1971,6 @@
               </w:rPr>
               <w:t>moondream</w:t>
             </w:r>
-            <w:proofErr w:type="spellEnd"/>
           </w:p>
         </w:tc>
         <w:tc>
@@ -2072,23 +2003,7 @@
                 <w:sz w:val="20"/>
                 <w:szCs w:val="22"/>
               </w:rPr>
-              <w:t xml:space="preserve">language model reading the receipt image directly and transcribing all visible text. Selected over </w:t>
-            </w:r>
-            <w:proofErr w:type="spellStart"/>
-            <w:r>
-              <w:rPr>
-                <w:sz w:val="20"/>
-                <w:szCs w:val="22"/>
-              </w:rPr>
-              <w:t>llava</w:t>
-            </w:r>
-            <w:proofErr w:type="spellEnd"/>
-            <w:r>
-              <w:rPr>
-                <w:sz w:val="20"/>
-                <w:szCs w:val="22"/>
-              </w:rPr>
-              <w:t xml:space="preserve"> specifically for CPU inference speed, at a documented accuracy trade</w:t>
+              <w:t>language model reading the receipt image directly and transcribing all visible text. Selected over llava specifically for CPU inference speed, at a documented accuracy trade</w:t>
             </w:r>
             <w:r>
               <w:rPr>
@@ -2366,7 +2281,15 @@
                 <w:sz w:val="20"/>
                 <w:szCs w:val="22"/>
               </w:rPr>
-              <w:t>proximity match) applied to the same raw OCR text used by the LLM path, so the 'with LLM' vs. 'without LLM' comparison is fair</w:t>
+              <w:t xml:space="preserve">proximity match) applied to the same raw OCR text used by the </w:t>
+            </w:r>
+            <w:r>
+              <w:rPr>
+                <w:sz w:val="20"/>
+                <w:szCs w:val="22"/>
+              </w:rPr>
+              <w:lastRenderedPageBreak/>
+              <w:t>LLM path, so the 'with LLM' vs. 'without LLM' comparison is fair</w:t>
             </w:r>
             <w:r>
               <w:rPr>
@@ -2398,6 +2321,7 @@
           <w:bCs/>
           <w:szCs w:val="22"/>
         </w:rPr>
+        <w:lastRenderedPageBreak/>
         <w:t>Note:</w:t>
       </w:r>
       <w:r>
@@ -2410,22 +2334,223 @@
         <w:rPr>
           <w:szCs w:val="22"/>
         </w:rPr>
-        <w:t xml:space="preserve">No paid APIs are used anywhere in the pipeline. The LLM runs locally via </w:t>
-      </w:r>
-      <w:proofErr w:type="spellStart"/>
-      <w:r>
-        <w:rPr>
-          <w:szCs w:val="22"/>
-        </w:rPr>
-        <w:t>Ollama</w:t>
-      </w:r>
-      <w:proofErr w:type="spellEnd"/>
-      <w:r>
-        <w:rPr>
-          <w:szCs w:val="22"/>
-        </w:rPr>
-        <w:t>.</w:t>
-      </w:r>
+        <w:t>No paid APIs are used anywhere in the pipeline. The LLM runs locally via Ollama.</w:t>
+      </w:r>
+    </w:p>
+    <w:p>
+      <w:pPr>
+        <w:rPr>
+          <w:szCs w:val="22"/>
+        </w:rPr>
+      </w:pPr>
+    </w:p>
+    <w:p>
+      <w:pPr>
+        <w:pStyle w:val="Heading3"/>
+        <w:rPr>
+          <w:rFonts w:asciiTheme="majorHAnsi" w:hAnsiTheme="majorHAnsi"/>
+        </w:rPr>
+      </w:pPr>
+      <w:r>
+        <w:rPr>
+          <w:rFonts w:asciiTheme="majorHAnsi" w:hAnsiTheme="majorHAnsi"/>
+        </w:rPr>
+        <w:t>Receipt transcription prompt template</w:t>
+      </w:r>
+    </w:p>
+    <w:p>
+      <w:pPr>
+        <w:spacing w:line="276" w:lineRule="auto"/>
+      </w:pPr>
+      <w:r>
+        <w:t xml:space="preserve">The prompt below is for the improved OCR stage that uses a multimodal (vision) LLM to read the receipt image directly and transcribe it, instead of running a traditional OCR engine. </w:t>
+      </w:r>
+      <w:r>
+        <w:t>This produces the raw text used for Condition 2 (</w:t>
+      </w:r>
+      <w:r>
+        <w:t>i</w:t>
+      </w:r>
+      <w:r>
+        <w:t>mproved OCR) and, after</w:t>
+      </w:r>
+      <w:r>
+        <w:t xml:space="preserve"> </w:t>
+      </w:r>
+      <w:r>
+        <w:t>entity extraction, Condition 4 (</w:t>
+      </w:r>
+      <w:r>
+        <w:t>i</w:t>
+      </w:r>
+      <w:r>
+        <w:t>mproved OCR + entity-analysis LLM).</w:t>
+      </w:r>
+    </w:p>
+    <w:tbl>
+      <w:tblPr>
+        <w:tblW w:w="9350" w:type="dxa"/>
+        <w:tblBorders>
+          <w:top w:val="single" w:sz="4" w:space="0" w:color="CCCCCC"/>
+          <w:left w:val="single" w:sz="4" w:space="0" w:color="CCCCCC"/>
+          <w:bottom w:val="single" w:sz="4" w:space="0" w:color="CCCCCC"/>
+          <w:right w:val="single" w:sz="4" w:space="0" w:color="CCCCCC"/>
+          <w:insideH w:val="single" w:sz="4" w:space="0" w:color="auto"/>
+          <w:insideV w:val="single" w:sz="4" w:space="0" w:color="auto"/>
+        </w:tblBorders>
+        <w:tblCellMar>
+          <w:left w:w="10" w:type="dxa"/>
+          <w:right w:w="10" w:type="dxa"/>
+        </w:tblCellMar>
+        <w:tblLook w:val="04A0" w:firstRow="1" w:lastRow="0" w:firstColumn="1" w:lastColumn="0" w:noHBand="0" w:noVBand="1"/>
+      </w:tblPr>
+      <w:tblGrid>
+        <w:gridCol w:w="9350"/>
+      </w:tblGrid>
+      <w:tr>
+        <w:tc>
+          <w:tcPr>
+            <w:tcW w:w="9350" w:type="dxa"/>
+            <w:shd w:val="clear" w:color="auto" w:fill="F4F4F4"/>
+            <w:tcMar>
+              <w:top w:w="150" w:type="dxa"/>
+              <w:left w:w="180" w:type="dxa"/>
+              <w:bottom w:w="150" w:type="dxa"/>
+              <w:right w:w="180" w:type="dxa"/>
+            </w:tcMar>
+          </w:tcPr>
+          <w:p>
+            <w:pPr>
+              <w:spacing w:after="80" w:line="240" w:lineRule="auto"/>
+              <w:rPr>
+                <w:rFonts w:ascii="Courier New" w:eastAsia="Courier New" w:hAnsi="Courier New" w:cs="Courier New"/>
+                <w:color w:val="222222"/>
+                <w:sz w:val="18"/>
+                <w:szCs w:val="18"/>
+              </w:rPr>
+            </w:pPr>
+            <w:r>
+              <w:rPr>
+                <w:rFonts w:ascii="Courier New" w:eastAsia="Courier New" w:hAnsi="Courier New" w:cs="Courier New"/>
+                <w:color w:val="222222"/>
+                <w:sz w:val="18"/>
+                <w:szCs w:val="18"/>
+              </w:rPr>
+              <w:t>Transcribe ALL text visible on this receipt image exactly as it appears,</w:t>
+            </w:r>
+          </w:p>
+          <w:p>
+            <w:pPr>
+              <w:spacing w:after="80" w:line="240" w:lineRule="auto"/>
+              <w:rPr>
+                <w:rFonts w:ascii="Courier New" w:eastAsia="Courier New" w:hAnsi="Courier New" w:cs="Courier New"/>
+                <w:color w:val="222222"/>
+                <w:sz w:val="18"/>
+                <w:szCs w:val="18"/>
+              </w:rPr>
+            </w:pPr>
+            <w:r>
+              <w:rPr>
+                <w:rFonts w:ascii="Courier New" w:eastAsia="Courier New" w:hAnsi="Courier New" w:cs="Courier New"/>
+                <w:color w:val="222222"/>
+                <w:sz w:val="18"/>
+                <w:szCs w:val="18"/>
+              </w:rPr>
+              <w:t>line by line, top to bottom. Include the store/company name, address</w:t>
+            </w:r>
+            <w:r>
+              <w:rPr>
+                <w:rFonts w:ascii="Courier New" w:eastAsia="Courier New" w:hAnsi="Courier New" w:cs="Courier New"/>
+                <w:color w:val="222222"/>
+                <w:sz w:val="18"/>
+                <w:szCs w:val="18"/>
+              </w:rPr>
+              <w:t>,</w:t>
+            </w:r>
+          </w:p>
+          <w:p>
+            <w:pPr>
+              <w:spacing w:after="80" w:line="240" w:lineRule="auto"/>
+              <w:rPr>
+                <w:rFonts w:ascii="Courier New" w:eastAsia="Courier New" w:hAnsi="Courier New" w:cs="Courier New"/>
+                <w:color w:val="222222"/>
+                <w:sz w:val="18"/>
+                <w:szCs w:val="18"/>
+              </w:rPr>
+            </w:pPr>
+            <w:r>
+              <w:rPr>
+                <w:rFonts w:ascii="Courier New" w:eastAsia="Courier New" w:hAnsi="Courier New" w:cs="Courier New"/>
+                <w:color w:val="222222"/>
+                <w:sz w:val="18"/>
+                <w:szCs w:val="18"/>
+              </w:rPr>
+              <w:t>date, all line items, and the total amount. Do not summarize, explain,</w:t>
+            </w:r>
+          </w:p>
+          <w:p>
+            <w:pPr>
+              <w:spacing w:after="80" w:line="240" w:lineRule="auto"/>
+            </w:pPr>
+            <w:r>
+              <w:rPr>
+                <w:rFonts w:ascii="Courier New" w:eastAsia="Courier New" w:hAnsi="Courier New" w:cs="Courier New"/>
+                <w:color w:val="222222"/>
+                <w:sz w:val="18"/>
+                <w:szCs w:val="18"/>
+              </w:rPr>
+              <w:t>or add commentary -- output only the transcribed text.</w:t>
+            </w:r>
+          </w:p>
+        </w:tc>
+      </w:tr>
+    </w:tbl>
+    <w:p>
+      <w:pPr>
+        <w:spacing w:line="276" w:lineRule="auto"/>
+        <w:rPr>
+          <w:rFonts w:eastAsia="Calibri" w:cs="Calibri"/>
+          <w:i/>
+          <w:iCs/>
+          <w:szCs w:val="22"/>
+        </w:rPr>
+      </w:pPr>
+      <w:r>
+        <w:rPr>
+          <w:rFonts w:eastAsia="Calibri" w:cs="Calibri"/>
+          <w:i/>
+          <w:iCs/>
+          <w:szCs w:val="22"/>
+        </w:rPr>
+        <w:t xml:space="preserve">Full implementation: </w:t>
+      </w:r>
+      <w:r>
+        <w:rPr>
+          <w:rFonts w:eastAsia="Calibri" w:cs="Calibri"/>
+          <w:i/>
+          <w:iCs/>
+          <w:szCs w:val="22"/>
+        </w:rPr>
+        <w:t>ocr_multimodal</w:t>
+      </w:r>
+      <w:r>
+        <w:rPr>
+          <w:rFonts w:eastAsia="Calibri" w:cs="Calibri"/>
+          <w:i/>
+          <w:iCs/>
+          <w:szCs w:val="22"/>
+        </w:rPr>
+        <w:t>.py in the accompanying code repository.</w:t>
+      </w:r>
+    </w:p>
+    <w:p>
+      <w:pPr>
+        <w:spacing w:line="276" w:lineRule="auto"/>
+        <w:rPr>
+          <w:rFonts w:eastAsia="Calibri" w:cs="Calibri"/>
+          <w:szCs w:val="22"/>
+        </w:rPr>
+      </w:pPr>
     </w:p>
     <w:p>
       <w:pPr>
@@ -2614,26 +2739,367 @@
                 <w:sz w:val="18"/>
                 <w:szCs w:val="18"/>
               </w:rPr>
+              <w:t>You are an information</w:t>
+            </w:r>
+            <w:r>
+              <w:rPr>
+                <w:rFonts w:ascii="Courier New" w:eastAsia="Courier New" w:hAnsi="Courier New" w:cs="Courier New"/>
+                <w:color w:val="222222"/>
+                <w:sz w:val="18"/>
+                <w:szCs w:val="18"/>
+              </w:rPr>
+              <w:t>-</w:t>
+            </w:r>
+            <w:r>
+              <w:rPr>
+                <w:rFonts w:ascii="Courier New" w:eastAsia="Courier New" w:hAnsi="Courier New" w:cs="Courier New"/>
+                <w:color w:val="222222"/>
+                <w:sz w:val="18"/>
+                <w:szCs w:val="18"/>
+              </w:rPr>
+              <w:t>extraction assistant for retail receipts.</w:t>
+            </w:r>
+            <w:r>
+              <w:br/>
+            </w:r>
+            <w:r>
+              <w:rPr>
+                <w:rFonts w:ascii="Courier New" w:eastAsia="Courier New" w:hAnsi="Courier New" w:cs="Courier New"/>
+                <w:color w:val="222222"/>
+                <w:sz w:val="18"/>
+                <w:szCs w:val="18"/>
+              </w:rPr>
+              <w:t xml:space="preserve"> </w:t>
+            </w:r>
+            <w:r>
+              <w:br/>
+            </w:r>
+            <w:r>
+              <w:rPr>
+                <w:rFonts w:ascii="Courier New" w:eastAsia="Courier New" w:hAnsi="Courier New" w:cs="Courier New"/>
+                <w:color w:val="222222"/>
+                <w:sz w:val="18"/>
+                <w:szCs w:val="18"/>
+              </w:rPr>
+              <w:t>You will be given raw OCR text extracted from a scanned receipt. The</w:t>
+            </w:r>
+            <w:r>
+              <w:br/>
+            </w:r>
+            <w:r>
+              <w:rPr>
+                <w:rFonts w:ascii="Courier New" w:eastAsia="Courier New" w:hAnsi="Courier New" w:cs="Courier New"/>
+                <w:color w:val="222222"/>
+                <w:sz w:val="18"/>
+                <w:szCs w:val="18"/>
+              </w:rPr>
+              <w:t>OCR text may contain errors: misrecognized characters, merged/split</w:t>
+            </w:r>
+            <w:r>
+              <w:br/>
+            </w:r>
+            <w:r>
+              <w:rPr>
+                <w:rFonts w:ascii="Courier New" w:eastAsia="Courier New" w:hAnsi="Courier New" w:cs="Courier New"/>
+                <w:color w:val="222222"/>
+                <w:sz w:val="18"/>
+                <w:szCs w:val="18"/>
+              </w:rPr>
+              <w:t>words, missing characters, or garbled entities (for example "sollor"</w:t>
+            </w:r>
+            <w:r>
+              <w:br/>
+            </w:r>
+            <w:r>
+              <w:rPr>
+                <w:rFonts w:ascii="Courier New" w:eastAsia="Courier New" w:hAnsi="Courier New" w:cs="Courier New"/>
+                <w:color w:val="222222"/>
+                <w:sz w:val="18"/>
+                <w:szCs w:val="18"/>
+              </w:rPr>
+              <w:t>instead of "seller", or a company name that is cut off mid</w:t>
+            </w:r>
+            <w:r>
+              <w:rPr>
+                <w:rFonts w:ascii="Courier New" w:eastAsia="Courier New" w:hAnsi="Courier New" w:cs="Courier New"/>
+                <w:color w:val="222222"/>
+                <w:sz w:val="18"/>
+                <w:szCs w:val="18"/>
+              </w:rPr>
+              <w:t>-</w:t>
+            </w:r>
+            <w:r>
+              <w:rPr>
+                <w:rFonts w:ascii="Courier New" w:eastAsia="Courier New" w:hAnsi="Courier New" w:cs="Courier New"/>
+                <w:color w:val="222222"/>
+                <w:sz w:val="18"/>
+                <w:szCs w:val="18"/>
+              </w:rPr>
+              <w:t>word).</w:t>
+            </w:r>
+            <w:r>
+              <w:br/>
+            </w:r>
+            <w:r>
+              <w:rPr>
+                <w:rFonts w:ascii="Courier New" w:eastAsia="Courier New" w:hAnsi="Courier New" w:cs="Courier New"/>
+                <w:color w:val="222222"/>
+                <w:sz w:val="18"/>
+                <w:szCs w:val="18"/>
+              </w:rPr>
+              <w:t xml:space="preserve"> </w:t>
+            </w:r>
+            <w:r>
+              <w:br/>
+            </w:r>
+            <w:r>
+              <w:rPr>
+                <w:rFonts w:ascii="Courier New" w:eastAsia="Courier New" w:hAnsi="Courier New" w:cs="Courier New"/>
+                <w:color w:val="222222"/>
+                <w:sz w:val="18"/>
+                <w:szCs w:val="18"/>
+              </w:rPr>
+              <w:t>Your job:</w:t>
+            </w:r>
+            <w:r>
+              <w:br/>
+            </w:r>
+            <w:r>
+              <w:rPr>
+                <w:rFonts w:ascii="Courier New" w:eastAsia="Courier New" w:hAnsi="Courier New" w:cs="Courier New"/>
+                <w:color w:val="222222"/>
+                <w:sz w:val="18"/>
+                <w:szCs w:val="18"/>
+              </w:rPr>
+              <w:t>1. Extract exactly these four fields: company, date, address, total.</w:t>
+            </w:r>
+            <w:r>
+              <w:br/>
+            </w:r>
+            <w:r>
+              <w:rPr>
+                <w:rFonts w:ascii="Courier New" w:eastAsia="Courier New" w:hAnsi="Courier New" w:cs="Courier New"/>
+                <w:color w:val="222222"/>
+                <w:sz w:val="18"/>
+                <w:szCs w:val="18"/>
+              </w:rPr>
+              <w:t>2. RECTIFY malformed entities: if a word is clearly a garbled OCR</w:t>
+            </w:r>
+            <w:r>
+              <w:br/>
+            </w:r>
+            <w:r>
+              <w:rPr>
+                <w:rFonts w:ascii="Courier New" w:eastAsia="Courier New" w:hAnsi="Courier New" w:cs="Courier New"/>
+                <w:color w:val="222222"/>
+                <w:sz w:val="18"/>
+                <w:szCs w:val="18"/>
+              </w:rPr>
+              <w:t xml:space="preserve">   version of a real word or name, correct it to the most plausible</w:t>
+            </w:r>
+            <w:r>
+              <w:br/>
+            </w:r>
+            <w:r>
+              <w:rPr>
+                <w:rFonts w:ascii="Courier New" w:eastAsia="Courier New" w:hAnsi="Courier New" w:cs="Courier New"/>
+                <w:color w:val="222222"/>
+                <w:sz w:val="18"/>
+                <w:szCs w:val="18"/>
+              </w:rPr>
+              <w:t xml:space="preserve">   real</w:t>
+            </w:r>
+            <w:r>
+              <w:rPr>
+                <w:rFonts w:ascii="Courier New" w:eastAsia="Courier New" w:hAnsi="Courier New" w:cs="Courier New"/>
+                <w:color w:val="222222"/>
+                <w:sz w:val="18"/>
+                <w:szCs w:val="18"/>
+              </w:rPr>
+              <w:t>-</w:t>
+            </w:r>
+            <w:r>
+              <w:rPr>
+                <w:rFonts w:ascii="Courier New" w:eastAsia="Courier New" w:hAnsi="Courier New" w:cs="Courier New"/>
+                <w:color w:val="222222"/>
+                <w:sz w:val="18"/>
+                <w:szCs w:val="18"/>
+              </w:rPr>
+              <w:t>world reading.</w:t>
+            </w:r>
+            <w:r>
+              <w:br/>
+            </w:r>
+            <w:r>
+              <w:rPr>
+                <w:rFonts w:ascii="Courier New" w:eastAsia="Courier New" w:hAnsi="Courier New" w:cs="Courier New"/>
+                <w:color w:val="222222"/>
+                <w:sz w:val="18"/>
+                <w:szCs w:val="18"/>
+              </w:rPr>
+              <w:t>3. COMPLETE compound entities that are missing components: if a</w:t>
+            </w:r>
+            <w:r>
+              <w:br/>
+            </w:r>
+            <w:r>
+              <w:rPr>
+                <w:rFonts w:ascii="Courier New" w:eastAsia="Courier New" w:hAnsi="Courier New" w:cs="Courier New"/>
+                <w:color w:val="222222"/>
+                <w:sz w:val="18"/>
+                <w:szCs w:val="18"/>
+              </w:rPr>
+              <w:t xml:space="preserve">   company name, address, or date is partially cut off but the</w:t>
+            </w:r>
+            <w:r>
+              <w:br/>
+            </w:r>
+            <w:r>
+              <w:rPr>
+                <w:rFonts w:ascii="Courier New" w:eastAsia="Courier New" w:hAnsi="Courier New" w:cs="Courier New"/>
+                <w:color w:val="222222"/>
+                <w:sz w:val="18"/>
+                <w:szCs w:val="18"/>
+              </w:rPr>
+              <w:t xml:space="preserve">   missing part can be reasonably inferred from context, complete it.</w:t>
+            </w:r>
+            <w:r>
+              <w:br/>
+            </w:r>
+            <w:r>
+              <w:rPr>
+                <w:rFonts w:ascii="Courier New" w:eastAsia="Courier New" w:hAnsi="Courier New" w:cs="Courier New"/>
+                <w:color w:val="222222"/>
+                <w:sz w:val="18"/>
+                <w:szCs w:val="18"/>
+              </w:rPr>
+              <w:t>4. If a field genuinely cannot be determined from the text, use</w:t>
+            </w:r>
+            <w:r>
+              <w:br/>
+            </w:r>
+            <w:r>
+              <w:rPr>
+                <w:rFonts w:ascii="Courier New" w:eastAsia="Courier New" w:hAnsi="Courier New" w:cs="Courier New"/>
+                <w:color w:val="222222"/>
+                <w:sz w:val="18"/>
+                <w:szCs w:val="18"/>
+              </w:rPr>
+              <w:t xml:space="preserve">   "unknown" </w:t>
+            </w:r>
+            <w:r>
+              <w:rPr>
+                <w:rFonts w:ascii="Courier New" w:eastAsia="Courier New" w:hAnsi="Courier New" w:cs="Courier New"/>
+                <w:color w:val="222222"/>
+                <w:sz w:val="18"/>
+                <w:szCs w:val="18"/>
+              </w:rPr>
+              <w:t>--</w:t>
+            </w:r>
+            <w:r>
+              <w:rPr>
+                <w:rFonts w:ascii="Courier New" w:eastAsia="Courier New" w:hAnsi="Courier New" w:cs="Courier New"/>
+                <w:color w:val="222222"/>
+                <w:sz w:val="18"/>
+                <w:szCs w:val="18"/>
+              </w:rPr>
+              <w:t xml:space="preserve"> do not guess wildly or invent unsupported values.</w:t>
+            </w:r>
+            <w:r>
+              <w:br/>
+            </w:r>
+            <w:r>
+              <w:rPr>
+                <w:rFonts w:ascii="Courier New" w:eastAsia="Courier New" w:hAnsi="Courier New" w:cs="Courier New"/>
+                <w:color w:val="222222"/>
+                <w:sz w:val="18"/>
+                <w:szCs w:val="18"/>
+              </w:rPr>
+              <w:t>5. Normalize the date to DD/MM/YYYY if present in any recognizable</w:t>
+            </w:r>
+            <w:r>
+              <w:br/>
+            </w:r>
+            <w:r>
+              <w:rPr>
+                <w:rFonts w:ascii="Courier New" w:eastAsia="Courier New" w:hAnsi="Courier New" w:cs="Courier New"/>
+                <w:color w:val="222222"/>
+                <w:sz w:val="18"/>
+                <w:szCs w:val="18"/>
+              </w:rPr>
+              <w:t xml:space="preserve">   format.</w:t>
+            </w:r>
+            <w:r>
+              <w:br/>
+            </w:r>
+            <w:r>
+              <w:rPr>
+                <w:rFonts w:ascii="Courier New" w:eastAsia="Courier New" w:hAnsi="Courier New" w:cs="Courier New"/>
+                <w:color w:val="222222"/>
+                <w:sz w:val="18"/>
+                <w:szCs w:val="18"/>
+              </w:rPr>
+              <w:t>6. Normalize the total to a plain number with two decimal places.</w:t>
+            </w:r>
+            <w:r>
+              <w:br/>
+            </w:r>
+            <w:r>
+              <w:rPr>
+                <w:rFonts w:ascii="Courier New" w:eastAsia="Courier New" w:hAnsi="Courier New" w:cs="Courier New"/>
+                <w:color w:val="222222"/>
+                <w:sz w:val="18"/>
+                <w:szCs w:val="18"/>
+              </w:rPr>
+              <w:t xml:space="preserve"> </w:t>
+            </w:r>
+            <w:r>
+              <w:br/>
+            </w:r>
+            <w:r>
+              <w:rPr>
+                <w:rFonts w:ascii="Courier New" w:eastAsia="Courier New" w:hAnsi="Courier New" w:cs="Courier New"/>
+                <w:color w:val="222222"/>
+                <w:sz w:val="18"/>
+                <w:szCs w:val="18"/>
+              </w:rPr>
+              <w:t>Respond with ONLY a JSON object in exactly this shape:</w:t>
+            </w:r>
+            <w:r>
+              <w:br/>
+            </w:r>
+            <w:r>
+              <w:rPr>
+                <w:rFonts w:ascii="Courier New" w:eastAsia="Courier New" w:hAnsi="Courier New" w:cs="Courier New"/>
+                <w:color w:val="222222"/>
+                <w:sz w:val="18"/>
+                <w:szCs w:val="18"/>
+              </w:rPr>
+              <w:t xml:space="preserve">{ "company": "...", "date": "...", "address": "...", "total": </w:t>
+            </w:r>
+            <w:proofErr w:type="gramStart"/>
+            <w:r>
+              <w:rPr>
+                <w:rFonts w:ascii="Courier New" w:eastAsia="Courier New" w:hAnsi="Courier New" w:cs="Courier New"/>
+                <w:color w:val="222222"/>
+                <w:sz w:val="18"/>
+                <w:szCs w:val="18"/>
+              </w:rPr>
+              <w:t>"..." }</w:t>
+            </w:r>
+            <w:proofErr w:type="gramEnd"/>
+            <w:r>
+              <w:br/>
+            </w:r>
+            <w:r>
+              <w:rPr>
+                <w:rFonts w:ascii="Courier New" w:eastAsia="Courier New" w:hAnsi="Courier New" w:cs="Courier New"/>
+                <w:color w:val="222222"/>
+                <w:sz w:val="18"/>
+                <w:szCs w:val="18"/>
+              </w:rPr>
               <w:lastRenderedPageBreak/>
-              <w:t>You are an information</w:t>
-            </w:r>
-            <w:r>
-              <w:rPr>
-                <w:rFonts w:ascii="Courier New" w:eastAsia="Courier New" w:hAnsi="Courier New" w:cs="Courier New"/>
-                <w:color w:val="222222"/>
-                <w:sz w:val="18"/>
-                <w:szCs w:val="18"/>
-              </w:rPr>
-              <w:t>-</w:t>
-            </w:r>
-            <w:r>
-              <w:rPr>
-                <w:rFonts w:ascii="Courier New" w:eastAsia="Courier New" w:hAnsi="Courier New" w:cs="Courier New"/>
-                <w:color w:val="222222"/>
-                <w:sz w:val="18"/>
-                <w:szCs w:val="18"/>
-              </w:rPr>
-              <w:t>extraction assistant for retail receipts.</w:t>
+              <w:t xml:space="preserve"> </w:t>
             </w:r>
             <w:r>
               <w:br/>
@@ -2645,7 +3111,7 @@
                 <w:sz w:val="18"/>
                 <w:szCs w:val="18"/>
               </w:rPr>
-              <w:t xml:space="preserve"> </w:t>
+              <w:t>OCR TEXT:</w:t>
             </w:r>
             <w:r>
               <w:br/>
@@ -2657,7 +3123,7 @@
                 <w:sz w:val="18"/>
                 <w:szCs w:val="18"/>
               </w:rPr>
-              <w:t>You will be given raw OCR text extracted from a scanned receipt. The</w:t>
+              <w:t>---</w:t>
             </w:r>
             <w:r>
               <w:br/>
@@ -2669,388 +3135,7 @@
                 <w:sz w:val="18"/>
                 <w:szCs w:val="18"/>
               </w:rPr>
-              <w:t>OCR text may contain errors: misrecognized characters, merged/split</w:t>
-            </w:r>
-            <w:r>
-              <w:br/>
-            </w:r>
-            <w:r>
-              <w:rPr>
-                <w:rFonts w:ascii="Courier New" w:eastAsia="Courier New" w:hAnsi="Courier New" w:cs="Courier New"/>
-                <w:color w:val="222222"/>
-                <w:sz w:val="18"/>
-                <w:szCs w:val="18"/>
-              </w:rPr>
-              <w:t>words, missing characters, or garbled entities (for example "</w:t>
-            </w:r>
-            <w:proofErr w:type="spellStart"/>
-            <w:r>
-              <w:rPr>
-                <w:rFonts w:ascii="Courier New" w:eastAsia="Courier New" w:hAnsi="Courier New" w:cs="Courier New"/>
-                <w:color w:val="222222"/>
-                <w:sz w:val="18"/>
-                <w:szCs w:val="18"/>
-              </w:rPr>
-              <w:t>sollor</w:t>
-            </w:r>
-            <w:proofErr w:type="spellEnd"/>
-            <w:r>
-              <w:rPr>
-                <w:rFonts w:ascii="Courier New" w:eastAsia="Courier New" w:hAnsi="Courier New" w:cs="Courier New"/>
-                <w:color w:val="222222"/>
-                <w:sz w:val="18"/>
-                <w:szCs w:val="18"/>
-              </w:rPr>
-              <w:t>"</w:t>
-            </w:r>
-            <w:r>
-              <w:br/>
-            </w:r>
-            <w:r>
-              <w:rPr>
-                <w:rFonts w:ascii="Courier New" w:eastAsia="Courier New" w:hAnsi="Courier New" w:cs="Courier New"/>
-                <w:color w:val="222222"/>
-                <w:sz w:val="18"/>
-                <w:szCs w:val="18"/>
-              </w:rPr>
-              <w:t>instead of "seller", or a company name that is cut off mid</w:t>
-            </w:r>
-            <w:r>
-              <w:rPr>
-                <w:rFonts w:ascii="Courier New" w:eastAsia="Courier New" w:hAnsi="Courier New" w:cs="Courier New"/>
-                <w:color w:val="222222"/>
-                <w:sz w:val="18"/>
-                <w:szCs w:val="18"/>
-              </w:rPr>
-              <w:t>-</w:t>
-            </w:r>
-            <w:r>
-              <w:rPr>
-                <w:rFonts w:ascii="Courier New" w:eastAsia="Courier New" w:hAnsi="Courier New" w:cs="Courier New"/>
-                <w:color w:val="222222"/>
-                <w:sz w:val="18"/>
-                <w:szCs w:val="18"/>
-              </w:rPr>
-              <w:t>word).</w:t>
-            </w:r>
-            <w:r>
-              <w:br/>
-            </w:r>
-            <w:r>
-              <w:rPr>
-                <w:rFonts w:ascii="Courier New" w:eastAsia="Courier New" w:hAnsi="Courier New" w:cs="Courier New"/>
-                <w:color w:val="222222"/>
-                <w:sz w:val="18"/>
-                <w:szCs w:val="18"/>
-              </w:rPr>
-              <w:t xml:space="preserve"> </w:t>
-            </w:r>
-            <w:r>
-              <w:br/>
-            </w:r>
-            <w:r>
-              <w:rPr>
-                <w:rFonts w:ascii="Courier New" w:eastAsia="Courier New" w:hAnsi="Courier New" w:cs="Courier New"/>
-                <w:color w:val="222222"/>
-                <w:sz w:val="18"/>
-                <w:szCs w:val="18"/>
-              </w:rPr>
-              <w:t>Your job:</w:t>
-            </w:r>
-            <w:r>
-              <w:br/>
-            </w:r>
-            <w:r>
-              <w:rPr>
-                <w:rFonts w:ascii="Courier New" w:eastAsia="Courier New" w:hAnsi="Courier New" w:cs="Courier New"/>
-                <w:color w:val="222222"/>
-                <w:sz w:val="18"/>
-                <w:szCs w:val="18"/>
-              </w:rPr>
-              <w:t>1. Extract exactly these four fields: company, date, address, total.</w:t>
-            </w:r>
-            <w:r>
-              <w:br/>
-            </w:r>
-            <w:r>
-              <w:rPr>
-                <w:rFonts w:ascii="Courier New" w:eastAsia="Courier New" w:hAnsi="Courier New" w:cs="Courier New"/>
-                <w:color w:val="222222"/>
-                <w:sz w:val="18"/>
-                <w:szCs w:val="18"/>
-              </w:rPr>
-              <w:t>2. RECTIFY malformed entities: if a word is clearly a garbled OCR</w:t>
-            </w:r>
-            <w:r>
-              <w:br/>
-            </w:r>
-            <w:r>
-              <w:rPr>
-                <w:rFonts w:ascii="Courier New" w:eastAsia="Courier New" w:hAnsi="Courier New" w:cs="Courier New"/>
-                <w:color w:val="222222"/>
-                <w:sz w:val="18"/>
-                <w:szCs w:val="18"/>
-              </w:rPr>
-              <w:t xml:space="preserve">   version of a real word or name, correct it to the most plausible</w:t>
-            </w:r>
-            <w:r>
-              <w:br/>
-            </w:r>
-            <w:r>
-              <w:rPr>
-                <w:rFonts w:ascii="Courier New" w:eastAsia="Courier New" w:hAnsi="Courier New" w:cs="Courier New"/>
-                <w:color w:val="222222"/>
-                <w:sz w:val="18"/>
-                <w:szCs w:val="18"/>
-              </w:rPr>
-              <w:t xml:space="preserve">   real</w:t>
-            </w:r>
-            <w:r>
-              <w:rPr>
-                <w:rFonts w:ascii="Courier New" w:eastAsia="Courier New" w:hAnsi="Courier New" w:cs="Courier New"/>
-                <w:color w:val="222222"/>
-                <w:sz w:val="18"/>
-                <w:szCs w:val="18"/>
-              </w:rPr>
-              <w:t>-</w:t>
-            </w:r>
-            <w:r>
-              <w:rPr>
-                <w:rFonts w:ascii="Courier New" w:eastAsia="Courier New" w:hAnsi="Courier New" w:cs="Courier New"/>
-                <w:color w:val="222222"/>
-                <w:sz w:val="18"/>
-                <w:szCs w:val="18"/>
-              </w:rPr>
-              <w:t>world reading.</w:t>
-            </w:r>
-            <w:r>
-              <w:br/>
-            </w:r>
-            <w:r>
-              <w:rPr>
-                <w:rFonts w:ascii="Courier New" w:eastAsia="Courier New" w:hAnsi="Courier New" w:cs="Courier New"/>
-                <w:color w:val="222222"/>
-                <w:sz w:val="18"/>
-                <w:szCs w:val="18"/>
-              </w:rPr>
-              <w:t>3. COMPLETE compound entities that are missing components: if a</w:t>
-            </w:r>
-            <w:r>
-              <w:br/>
-            </w:r>
-            <w:r>
-              <w:rPr>
-                <w:rFonts w:ascii="Courier New" w:eastAsia="Courier New" w:hAnsi="Courier New" w:cs="Courier New"/>
-                <w:color w:val="222222"/>
-                <w:sz w:val="18"/>
-                <w:szCs w:val="18"/>
-              </w:rPr>
-              <w:t xml:space="preserve">   company name, address, or date is partially cut off but the</w:t>
-            </w:r>
-            <w:r>
-              <w:br/>
-            </w:r>
-            <w:r>
-              <w:rPr>
-                <w:rFonts w:ascii="Courier New" w:eastAsia="Courier New" w:hAnsi="Courier New" w:cs="Courier New"/>
-                <w:color w:val="222222"/>
-                <w:sz w:val="18"/>
-                <w:szCs w:val="18"/>
-              </w:rPr>
-              <w:t xml:space="preserve">   missing part can be reasonably inferred from context, complete it.</w:t>
-            </w:r>
-            <w:r>
-              <w:br/>
-            </w:r>
-            <w:r>
-              <w:rPr>
-                <w:rFonts w:ascii="Courier New" w:eastAsia="Courier New" w:hAnsi="Courier New" w:cs="Courier New"/>
-                <w:color w:val="222222"/>
-                <w:sz w:val="18"/>
-                <w:szCs w:val="18"/>
-              </w:rPr>
-              <w:t>4. If a field genuinely cannot be determined from the text, use</w:t>
-            </w:r>
-            <w:r>
-              <w:br/>
-            </w:r>
-            <w:r>
-              <w:rPr>
-                <w:rFonts w:ascii="Courier New" w:eastAsia="Courier New" w:hAnsi="Courier New" w:cs="Courier New"/>
-                <w:color w:val="222222"/>
-                <w:sz w:val="18"/>
-                <w:szCs w:val="18"/>
-              </w:rPr>
-              <w:t xml:space="preserve">   "unknown" </w:t>
-            </w:r>
-            <w:r>
-              <w:rPr>
-                <w:rFonts w:ascii="Courier New" w:eastAsia="Courier New" w:hAnsi="Courier New" w:cs="Courier New"/>
-                <w:color w:val="222222"/>
-                <w:sz w:val="18"/>
-                <w:szCs w:val="18"/>
-              </w:rPr>
-              <w:t>--</w:t>
-            </w:r>
-            <w:r>
-              <w:rPr>
-                <w:rFonts w:ascii="Courier New" w:eastAsia="Courier New" w:hAnsi="Courier New" w:cs="Courier New"/>
-                <w:color w:val="222222"/>
-                <w:sz w:val="18"/>
-                <w:szCs w:val="18"/>
-              </w:rPr>
-              <w:t xml:space="preserve"> do not guess wildly or invent unsupported values.</w:t>
-            </w:r>
-            <w:r>
-              <w:br/>
-            </w:r>
-            <w:r>
-              <w:rPr>
-                <w:rFonts w:ascii="Courier New" w:eastAsia="Courier New" w:hAnsi="Courier New" w:cs="Courier New"/>
-                <w:color w:val="222222"/>
-                <w:sz w:val="18"/>
-                <w:szCs w:val="18"/>
-              </w:rPr>
-              <w:t>5. Normalize the date to DD/MM/YYYY if present in any recognizable</w:t>
-            </w:r>
-            <w:r>
-              <w:br/>
-            </w:r>
-            <w:r>
-              <w:rPr>
-                <w:rFonts w:ascii="Courier New" w:eastAsia="Courier New" w:hAnsi="Courier New" w:cs="Courier New"/>
-                <w:color w:val="222222"/>
-                <w:sz w:val="18"/>
-                <w:szCs w:val="18"/>
-              </w:rPr>
-              <w:t xml:space="preserve">   format.</w:t>
-            </w:r>
-            <w:r>
-              <w:br/>
-            </w:r>
-            <w:r>
-              <w:rPr>
-                <w:rFonts w:ascii="Courier New" w:eastAsia="Courier New" w:hAnsi="Courier New" w:cs="Courier New"/>
-                <w:color w:val="222222"/>
-                <w:sz w:val="18"/>
-                <w:szCs w:val="18"/>
-              </w:rPr>
-              <w:t>6. Normalize the total to a plain number with two decimal places.</w:t>
-            </w:r>
-            <w:r>
-              <w:br/>
-            </w:r>
-            <w:r>
-              <w:rPr>
-                <w:rFonts w:ascii="Courier New" w:eastAsia="Courier New" w:hAnsi="Courier New" w:cs="Courier New"/>
-                <w:color w:val="222222"/>
-                <w:sz w:val="18"/>
-                <w:szCs w:val="18"/>
-              </w:rPr>
-              <w:t xml:space="preserve"> </w:t>
-            </w:r>
-            <w:r>
-              <w:br/>
-            </w:r>
-            <w:r>
-              <w:rPr>
-                <w:rFonts w:ascii="Courier New" w:eastAsia="Courier New" w:hAnsi="Courier New" w:cs="Courier New"/>
-                <w:color w:val="222222"/>
-                <w:sz w:val="18"/>
-                <w:szCs w:val="18"/>
-              </w:rPr>
-              <w:t>Respond with ONLY a JSON object in exactly this shape:</w:t>
-            </w:r>
-            <w:r>
-              <w:br/>
-            </w:r>
-            <w:r>
-              <w:rPr>
-                <w:rFonts w:ascii="Courier New" w:eastAsia="Courier New" w:hAnsi="Courier New" w:cs="Courier New"/>
-                <w:color w:val="222222"/>
-                <w:sz w:val="18"/>
-                <w:szCs w:val="18"/>
-              </w:rPr>
-              <w:t xml:space="preserve">{ "company": "...", "date": "...", "address": "...", "total": </w:t>
-            </w:r>
-            <w:proofErr w:type="gramStart"/>
-            <w:r>
-              <w:rPr>
-                <w:rFonts w:ascii="Courier New" w:eastAsia="Courier New" w:hAnsi="Courier New" w:cs="Courier New"/>
-                <w:color w:val="222222"/>
-                <w:sz w:val="18"/>
-                <w:szCs w:val="18"/>
-              </w:rPr>
-              <w:t>"..." }</w:t>
-            </w:r>
-            <w:proofErr w:type="gramEnd"/>
-            <w:r>
-              <w:br/>
-            </w:r>
-            <w:r>
-              <w:rPr>
-                <w:rFonts w:ascii="Courier New" w:eastAsia="Courier New" w:hAnsi="Courier New" w:cs="Courier New"/>
-                <w:color w:val="222222"/>
-                <w:sz w:val="18"/>
-                <w:szCs w:val="18"/>
-              </w:rPr>
-              <w:t xml:space="preserve"> </w:t>
-            </w:r>
-            <w:r>
-              <w:br/>
-            </w:r>
-            <w:r>
-              <w:rPr>
-                <w:rFonts w:ascii="Courier New" w:eastAsia="Courier New" w:hAnsi="Courier New" w:cs="Courier New"/>
-                <w:color w:val="222222"/>
-                <w:sz w:val="18"/>
-                <w:szCs w:val="18"/>
-              </w:rPr>
-              <w:t>OCR TEXT:</w:t>
-            </w:r>
-            <w:r>
-              <w:br/>
-            </w:r>
-            <w:r>
-              <w:rPr>
-                <w:rFonts w:ascii="Courier New" w:eastAsia="Courier New" w:hAnsi="Courier New" w:cs="Courier New"/>
-                <w:color w:val="222222"/>
-                <w:sz w:val="18"/>
-                <w:szCs w:val="18"/>
-              </w:rPr>
-              <w:t>---</w:t>
-            </w:r>
-            <w:r>
-              <w:br/>
-            </w:r>
-            <w:r>
-              <w:rPr>
-                <w:rFonts w:ascii="Courier New" w:eastAsia="Courier New" w:hAnsi="Courier New" w:cs="Courier New"/>
-                <w:color w:val="222222"/>
-                <w:sz w:val="18"/>
-                <w:szCs w:val="18"/>
-              </w:rPr>
-              <w:t>{</w:t>
-            </w:r>
-            <w:proofErr w:type="spellStart"/>
-            <w:r>
-              <w:rPr>
-                <w:rFonts w:ascii="Courier New" w:eastAsia="Courier New" w:hAnsi="Courier New" w:cs="Courier New"/>
-                <w:color w:val="222222"/>
-                <w:sz w:val="18"/>
-                <w:szCs w:val="18"/>
-              </w:rPr>
-              <w:t>ocr_text</w:t>
-            </w:r>
-            <w:proofErr w:type="spellEnd"/>
-            <w:r>
-              <w:rPr>
-                <w:rFonts w:ascii="Courier New" w:eastAsia="Courier New" w:hAnsi="Courier New" w:cs="Courier New"/>
-                <w:color w:val="222222"/>
-                <w:sz w:val="18"/>
-                <w:szCs w:val="18"/>
-              </w:rPr>
-              <w:t>}</w:t>
+              <w:t>{ocr_text}</w:t>
             </w:r>
             <w:r>
               <w:br/>
@@ -3085,12 +3170,522 @@
           <w:iCs/>
           <w:szCs w:val="22"/>
         </w:rPr>
+        <w:lastRenderedPageBreak/>
         <w:t>Full implementation: entity_extraction.py in the accompanying code repository.</w:t>
       </w:r>
     </w:p>
     <w:p>
       <w:pPr>
         <w:spacing w:line="276" w:lineRule="auto"/>
+        <w:rPr>
+          <w:rFonts w:eastAsia="Calibri" w:cs="Calibri"/>
+          <w:szCs w:val="22"/>
+        </w:rPr>
+      </w:pPr>
+    </w:p>
+    <w:p>
+      <w:pPr>
+        <w:pStyle w:val="Heading3"/>
+      </w:pPr>
+      <w:r>
+        <w:t>Question-answering prompt template</w:t>
+      </w:r>
+    </w:p>
+    <w:p>
+      <w:r>
+        <w:t xml:space="preserve">The prompt below is for the </w:t>
+      </w:r>
+      <w:r>
+        <w:rPr>
+          <w:b/>
+          <w:bCs/>
+        </w:rPr>
+        <w:t xml:space="preserve">question-answering </w:t>
+      </w:r>
+      <w:r>
+        <w:t xml:space="preserve">feature of the Gradio application. The user may ask free-form questions about the receipt, the LLM answers the question </w:t>
+      </w:r>
+      <w:r>
+        <w:t xml:space="preserve">using </w:t>
+      </w:r>
+      <w:r>
+        <w:t xml:space="preserve">the retrieved data </w:t>
+      </w:r>
+      <w:r>
+        <w:t>as grounding context. If the question cannot be answered using the extracted data, the raw OCR text is also supplied to the LLM.</w:t>
+      </w:r>
+    </w:p>
+    <w:tbl>
+      <w:tblPr>
+        <w:tblW w:w="9350" w:type="dxa"/>
+        <w:tblBorders>
+          <w:top w:val="single" w:sz="4" w:space="0" w:color="CCCCCC"/>
+          <w:left w:val="single" w:sz="4" w:space="0" w:color="CCCCCC"/>
+          <w:bottom w:val="single" w:sz="4" w:space="0" w:color="CCCCCC"/>
+          <w:right w:val="single" w:sz="4" w:space="0" w:color="CCCCCC"/>
+          <w:insideH w:val="single" w:sz="4" w:space="0" w:color="auto"/>
+          <w:insideV w:val="single" w:sz="4" w:space="0" w:color="auto"/>
+        </w:tblBorders>
+        <w:tblCellMar>
+          <w:left w:w="10" w:type="dxa"/>
+          <w:right w:w="10" w:type="dxa"/>
+        </w:tblCellMar>
+        <w:tblLook w:val="04A0" w:firstRow="1" w:lastRow="0" w:firstColumn="1" w:lastColumn="0" w:noHBand="0" w:noVBand="1"/>
+      </w:tblPr>
+      <w:tblGrid>
+        <w:gridCol w:w="9350"/>
+      </w:tblGrid>
+      <w:tr>
+        <w:tc>
+          <w:tcPr>
+            <w:tcW w:w="9350" w:type="dxa"/>
+            <w:shd w:val="clear" w:color="auto" w:fill="F4F4F4"/>
+            <w:tcMar>
+              <w:top w:w="150" w:type="dxa"/>
+              <w:left w:w="180" w:type="dxa"/>
+              <w:bottom w:w="150" w:type="dxa"/>
+              <w:right w:w="180" w:type="dxa"/>
+            </w:tcMar>
+          </w:tcPr>
+          <w:p>
+            <w:pPr>
+              <w:spacing w:after="80" w:line="240" w:lineRule="auto"/>
+              <w:rPr>
+                <w:rFonts w:ascii="Courier New" w:eastAsia="Courier New" w:hAnsi="Courier New" w:cs="Courier New"/>
+                <w:color w:val="222222"/>
+                <w:sz w:val="18"/>
+                <w:szCs w:val="18"/>
+              </w:rPr>
+            </w:pPr>
+            <w:r>
+              <w:rPr>
+                <w:rFonts w:ascii="Courier New" w:eastAsia="Courier New" w:hAnsi="Courier New" w:cs="Courier New"/>
+                <w:color w:val="222222"/>
+                <w:sz w:val="18"/>
+                <w:szCs w:val="18"/>
+              </w:rPr>
+              <w:t>You are answering questions about a receipt based on the extracted data below.</w:t>
+            </w:r>
+          </w:p>
+          <w:p>
+            <w:pPr>
+              <w:spacing w:after="80" w:line="240" w:lineRule="auto"/>
+              <w:rPr>
+                <w:rFonts w:ascii="Courier New" w:eastAsia="Courier New" w:hAnsi="Courier New" w:cs="Courier New"/>
+                <w:color w:val="222222"/>
+                <w:sz w:val="18"/>
+                <w:szCs w:val="18"/>
+              </w:rPr>
+            </w:pPr>
+            <w:r>
+              <w:rPr>
+                <w:rFonts w:ascii="Courier New" w:eastAsia="Courier New" w:hAnsi="Courier New" w:cs="Courier New"/>
+                <w:color w:val="222222"/>
+                <w:sz w:val="18"/>
+                <w:szCs w:val="18"/>
+              </w:rPr>
+              <w:t>If the answer isn't contained in the data, say so rather than guessing.</w:t>
+            </w:r>
+          </w:p>
+          <w:p>
+            <w:pPr>
+              <w:spacing w:after="80" w:line="240" w:lineRule="auto"/>
+              <w:rPr>
+                <w:rFonts w:ascii="Courier New" w:eastAsia="Courier New" w:hAnsi="Courier New" w:cs="Courier New"/>
+                <w:color w:val="222222"/>
+                <w:sz w:val="18"/>
+                <w:szCs w:val="18"/>
+              </w:rPr>
+            </w:pPr>
+          </w:p>
+          <w:p>
+            <w:pPr>
+              <w:spacing w:after="80" w:line="240" w:lineRule="auto"/>
+              <w:rPr>
+                <w:rFonts w:ascii="Courier New" w:eastAsia="Courier New" w:hAnsi="Courier New" w:cs="Courier New"/>
+                <w:color w:val="222222"/>
+                <w:sz w:val="18"/>
+                <w:szCs w:val="18"/>
+              </w:rPr>
+            </w:pPr>
+            <w:r>
+              <w:rPr>
+                <w:rFonts w:ascii="Courier New" w:eastAsia="Courier New" w:hAnsi="Courier New" w:cs="Courier New"/>
+                <w:color w:val="222222"/>
+                <w:sz w:val="18"/>
+                <w:szCs w:val="18"/>
+              </w:rPr>
+              <w:t>Extracted fields:</w:t>
+            </w:r>
+          </w:p>
+          <w:p>
+            <w:pPr>
+              <w:spacing w:after="80" w:line="240" w:lineRule="auto"/>
+              <w:rPr>
+                <w:rFonts w:ascii="Courier New" w:eastAsia="Courier New" w:hAnsi="Courier New" w:cs="Courier New"/>
+                <w:color w:val="222222"/>
+                <w:sz w:val="18"/>
+                <w:szCs w:val="18"/>
+              </w:rPr>
+            </w:pPr>
+            <w:r>
+              <w:rPr>
+                <w:rFonts w:ascii="Courier New" w:eastAsia="Courier New" w:hAnsi="Courier New" w:cs="Courier New"/>
+                <w:color w:val="222222"/>
+                <w:sz w:val="18"/>
+                <w:szCs w:val="18"/>
+              </w:rPr>
+              <w:t xml:space="preserve">  </w:t>
+            </w:r>
+            <w:proofErr w:type="gramStart"/>
+            <w:r>
+              <w:rPr>
+                <w:rFonts w:ascii="Courier New" w:eastAsia="Courier New" w:hAnsi="Courier New" w:cs="Courier New"/>
+                <w:color w:val="222222"/>
+                <w:sz w:val="18"/>
+                <w:szCs w:val="18"/>
+              </w:rPr>
+              <w:t>company: {</w:t>
+            </w:r>
+            <w:proofErr w:type="gramEnd"/>
+            <w:r>
+              <w:rPr>
+                <w:rFonts w:ascii="Courier New" w:eastAsia="Courier New" w:hAnsi="Courier New" w:cs="Courier New"/>
+                <w:color w:val="222222"/>
+                <w:sz w:val="18"/>
+                <w:szCs w:val="18"/>
+              </w:rPr>
+              <w:t>company}</w:t>
+            </w:r>
+          </w:p>
+          <w:p>
+            <w:pPr>
+              <w:spacing w:after="80" w:line="240" w:lineRule="auto"/>
+              <w:rPr>
+                <w:rFonts w:ascii="Courier New" w:eastAsia="Courier New" w:hAnsi="Courier New" w:cs="Courier New"/>
+                <w:color w:val="222222"/>
+                <w:sz w:val="18"/>
+                <w:szCs w:val="18"/>
+              </w:rPr>
+            </w:pPr>
+            <w:r>
+              <w:rPr>
+                <w:rFonts w:ascii="Courier New" w:eastAsia="Courier New" w:hAnsi="Courier New" w:cs="Courier New"/>
+                <w:color w:val="222222"/>
+                <w:sz w:val="18"/>
+                <w:szCs w:val="18"/>
+              </w:rPr>
+              <w:t xml:space="preserve">  </w:t>
+            </w:r>
+            <w:proofErr w:type="gramStart"/>
+            <w:r>
+              <w:rPr>
+                <w:rFonts w:ascii="Courier New" w:eastAsia="Courier New" w:hAnsi="Courier New" w:cs="Courier New"/>
+                <w:color w:val="222222"/>
+                <w:sz w:val="18"/>
+                <w:szCs w:val="18"/>
+              </w:rPr>
+              <w:t>date: {</w:t>
+            </w:r>
+            <w:proofErr w:type="gramEnd"/>
+            <w:r>
+              <w:rPr>
+                <w:rFonts w:ascii="Courier New" w:eastAsia="Courier New" w:hAnsi="Courier New" w:cs="Courier New"/>
+                <w:color w:val="222222"/>
+                <w:sz w:val="18"/>
+                <w:szCs w:val="18"/>
+              </w:rPr>
+              <w:t>date}</w:t>
+            </w:r>
+          </w:p>
+          <w:p>
+            <w:pPr>
+              <w:spacing w:after="80" w:line="240" w:lineRule="auto"/>
+              <w:rPr>
+                <w:rFonts w:ascii="Courier New" w:eastAsia="Courier New" w:hAnsi="Courier New" w:cs="Courier New"/>
+                <w:color w:val="222222"/>
+                <w:sz w:val="18"/>
+                <w:szCs w:val="18"/>
+              </w:rPr>
+            </w:pPr>
+            <w:r>
+              <w:rPr>
+                <w:rFonts w:ascii="Courier New" w:eastAsia="Courier New" w:hAnsi="Courier New" w:cs="Courier New"/>
+                <w:color w:val="222222"/>
+                <w:sz w:val="18"/>
+                <w:szCs w:val="18"/>
+              </w:rPr>
+              <w:t xml:space="preserve">  </w:t>
+            </w:r>
+            <w:proofErr w:type="gramStart"/>
+            <w:r>
+              <w:rPr>
+                <w:rFonts w:ascii="Courier New" w:eastAsia="Courier New" w:hAnsi="Courier New" w:cs="Courier New"/>
+                <w:color w:val="222222"/>
+                <w:sz w:val="18"/>
+                <w:szCs w:val="18"/>
+              </w:rPr>
+              <w:t>address: {</w:t>
+            </w:r>
+            <w:proofErr w:type="gramEnd"/>
+            <w:r>
+              <w:rPr>
+                <w:rFonts w:ascii="Courier New" w:eastAsia="Courier New" w:hAnsi="Courier New" w:cs="Courier New"/>
+                <w:color w:val="222222"/>
+                <w:sz w:val="18"/>
+                <w:szCs w:val="18"/>
+              </w:rPr>
+              <w:t>address}</w:t>
+            </w:r>
+          </w:p>
+          <w:p>
+            <w:pPr>
+              <w:spacing w:after="80" w:line="240" w:lineRule="auto"/>
+              <w:rPr>
+                <w:rFonts w:ascii="Courier New" w:eastAsia="Courier New" w:hAnsi="Courier New" w:cs="Courier New"/>
+                <w:color w:val="222222"/>
+                <w:sz w:val="18"/>
+                <w:szCs w:val="18"/>
+              </w:rPr>
+            </w:pPr>
+            <w:r>
+              <w:rPr>
+                <w:rFonts w:ascii="Courier New" w:eastAsia="Courier New" w:hAnsi="Courier New" w:cs="Courier New"/>
+                <w:color w:val="222222"/>
+                <w:sz w:val="18"/>
+                <w:szCs w:val="18"/>
+              </w:rPr>
+              <w:t xml:space="preserve">  </w:t>
+            </w:r>
+            <w:proofErr w:type="gramStart"/>
+            <w:r>
+              <w:rPr>
+                <w:rFonts w:ascii="Courier New" w:eastAsia="Courier New" w:hAnsi="Courier New" w:cs="Courier New"/>
+                <w:color w:val="222222"/>
+                <w:sz w:val="18"/>
+                <w:szCs w:val="18"/>
+              </w:rPr>
+              <w:t>total: {</w:t>
+            </w:r>
+            <w:proofErr w:type="gramEnd"/>
+            <w:r>
+              <w:rPr>
+                <w:rFonts w:ascii="Courier New" w:eastAsia="Courier New" w:hAnsi="Courier New" w:cs="Courier New"/>
+                <w:color w:val="222222"/>
+                <w:sz w:val="18"/>
+                <w:szCs w:val="18"/>
+              </w:rPr>
+              <w:t>total}</w:t>
+            </w:r>
+          </w:p>
+          <w:p>
+            <w:pPr>
+              <w:spacing w:after="80" w:line="240" w:lineRule="auto"/>
+              <w:rPr>
+                <w:rFonts w:ascii="Courier New" w:eastAsia="Courier New" w:hAnsi="Courier New" w:cs="Courier New"/>
+                <w:color w:val="222222"/>
+                <w:sz w:val="18"/>
+                <w:szCs w:val="18"/>
+              </w:rPr>
+            </w:pPr>
+          </w:p>
+          <w:p>
+            <w:pPr>
+              <w:spacing w:after="80" w:line="240" w:lineRule="auto"/>
+              <w:rPr>
+                <w:rFonts w:ascii="Courier New" w:eastAsia="Courier New" w:hAnsi="Courier New" w:cs="Courier New"/>
+                <w:color w:val="222222"/>
+                <w:sz w:val="18"/>
+                <w:szCs w:val="18"/>
+              </w:rPr>
+            </w:pPr>
+            <w:r>
+              <w:rPr>
+                <w:rFonts w:ascii="Courier New" w:eastAsia="Courier New" w:hAnsi="Courier New" w:cs="Courier New"/>
+                <w:color w:val="222222"/>
+                <w:sz w:val="18"/>
+                <w:szCs w:val="18"/>
+              </w:rPr>
+              <w:t>Raw OCR text (use only if the extracted fields above don't answer the question):</w:t>
+            </w:r>
+          </w:p>
+          <w:p>
+            <w:pPr>
+              <w:spacing w:after="80" w:line="240" w:lineRule="auto"/>
+              <w:rPr>
+                <w:rFonts w:ascii="Courier New" w:eastAsia="Courier New" w:hAnsi="Courier New" w:cs="Courier New"/>
+                <w:color w:val="222222"/>
+                <w:sz w:val="18"/>
+                <w:szCs w:val="18"/>
+              </w:rPr>
+            </w:pPr>
+            <w:r>
+              <w:rPr>
+                <w:rFonts w:ascii="Courier New" w:eastAsia="Courier New" w:hAnsi="Courier New" w:cs="Courier New"/>
+                <w:color w:val="222222"/>
+                <w:sz w:val="18"/>
+                <w:szCs w:val="18"/>
+              </w:rPr>
+              <w:t>---</w:t>
+            </w:r>
+          </w:p>
+          <w:p>
+            <w:pPr>
+              <w:spacing w:after="80" w:line="240" w:lineRule="auto"/>
+              <w:rPr>
+                <w:rFonts w:ascii="Courier New" w:eastAsia="Courier New" w:hAnsi="Courier New" w:cs="Courier New"/>
+                <w:color w:val="222222"/>
+                <w:sz w:val="18"/>
+                <w:szCs w:val="18"/>
+              </w:rPr>
+            </w:pPr>
+            <w:r>
+              <w:rPr>
+                <w:rFonts w:ascii="Courier New" w:eastAsia="Courier New" w:hAnsi="Courier New" w:cs="Courier New"/>
+                <w:color w:val="222222"/>
+                <w:sz w:val="18"/>
+                <w:szCs w:val="18"/>
+              </w:rPr>
+              <w:t>{raw_text}</w:t>
+            </w:r>
+          </w:p>
+          <w:p>
+            <w:pPr>
+              <w:spacing w:after="80" w:line="240" w:lineRule="auto"/>
+              <w:rPr>
+                <w:rFonts w:ascii="Courier New" w:eastAsia="Courier New" w:hAnsi="Courier New" w:cs="Courier New"/>
+                <w:color w:val="222222"/>
+                <w:sz w:val="18"/>
+                <w:szCs w:val="18"/>
+              </w:rPr>
+            </w:pPr>
+            <w:r>
+              <w:rPr>
+                <w:rFonts w:ascii="Courier New" w:eastAsia="Courier New" w:hAnsi="Courier New" w:cs="Courier New"/>
+                <w:color w:val="222222"/>
+                <w:sz w:val="18"/>
+                <w:szCs w:val="18"/>
+              </w:rPr>
+              <w:t>---</w:t>
+            </w:r>
+          </w:p>
+          <w:p>
+            <w:pPr>
+              <w:spacing w:after="80" w:line="240" w:lineRule="auto"/>
+              <w:rPr>
+                <w:rFonts w:ascii="Courier New" w:eastAsia="Courier New" w:hAnsi="Courier New" w:cs="Courier New"/>
+                <w:color w:val="222222"/>
+                <w:sz w:val="18"/>
+                <w:szCs w:val="18"/>
+              </w:rPr>
+            </w:pPr>
+          </w:p>
+          <w:p>
+            <w:pPr>
+              <w:spacing w:after="80" w:line="240" w:lineRule="auto"/>
+              <w:rPr>
+                <w:rFonts w:ascii="Courier New" w:eastAsia="Courier New" w:hAnsi="Courier New" w:cs="Courier New"/>
+                <w:color w:val="222222"/>
+                <w:sz w:val="18"/>
+                <w:szCs w:val="18"/>
+              </w:rPr>
+            </w:pPr>
+            <w:proofErr w:type="gramStart"/>
+            <w:r>
+              <w:rPr>
+                <w:rFonts w:ascii="Courier New" w:eastAsia="Courier New" w:hAnsi="Courier New" w:cs="Courier New"/>
+                <w:color w:val="222222"/>
+                <w:sz w:val="18"/>
+                <w:szCs w:val="18"/>
+              </w:rPr>
+              <w:t>Question: {</w:t>
+            </w:r>
+            <w:proofErr w:type="gramEnd"/>
+            <w:r>
+              <w:rPr>
+                <w:rFonts w:ascii="Courier New" w:eastAsia="Courier New" w:hAnsi="Courier New" w:cs="Courier New"/>
+                <w:color w:val="222222"/>
+                <w:sz w:val="18"/>
+                <w:szCs w:val="18"/>
+              </w:rPr>
+              <w:t>question}</w:t>
+            </w:r>
+          </w:p>
+          <w:p>
+            <w:pPr>
+              <w:spacing w:after="80" w:line="240" w:lineRule="auto"/>
+              <w:rPr>
+                <w:rFonts w:ascii="Courier New" w:eastAsia="Courier New" w:hAnsi="Courier New" w:cs="Courier New"/>
+                <w:color w:val="222222"/>
+                <w:sz w:val="18"/>
+                <w:szCs w:val="18"/>
+              </w:rPr>
+            </w:pPr>
+          </w:p>
+          <w:p>
+            <w:pPr>
+              <w:spacing w:after="80" w:line="240" w:lineRule="auto"/>
+              <w:rPr>
+                <w:rFonts w:ascii="Courier New" w:eastAsia="Courier New" w:hAnsi="Courier New" w:cs="Courier New"/>
+                <w:color w:val="222222"/>
+                <w:sz w:val="18"/>
+                <w:szCs w:val="18"/>
+              </w:rPr>
+            </w:pPr>
+            <w:r>
+              <w:rPr>
+                <w:rFonts w:ascii="Courier New" w:eastAsia="Courier New" w:hAnsi="Courier New" w:cs="Courier New"/>
+                <w:color w:val="222222"/>
+                <w:sz w:val="18"/>
+                <w:szCs w:val="18"/>
+              </w:rPr>
+              <w:t>Answer concisely in one or two sentences.</w:t>
+            </w:r>
+          </w:p>
+        </w:tc>
+      </w:tr>
+    </w:tbl>
+    <w:p>
+      <w:pPr>
+        <w:spacing w:line="276" w:lineRule="auto"/>
+        <w:rPr>
+          <w:rFonts w:eastAsia="Calibri" w:cs="Calibri"/>
+          <w:i/>
+          <w:iCs/>
+          <w:szCs w:val="22"/>
+        </w:rPr>
+      </w:pPr>
+      <w:r>
+        <w:rPr>
+          <w:rFonts w:eastAsia="Calibri" w:cs="Calibri"/>
+          <w:i/>
+          <w:iCs/>
+          <w:szCs w:val="22"/>
+        </w:rPr>
+        <w:t xml:space="preserve">Full implementation: </w:t>
+      </w:r>
+      <w:r>
+        <w:rPr>
+          <w:rFonts w:eastAsia="Calibri" w:cs="Calibri"/>
+          <w:i/>
+          <w:iCs/>
+          <w:szCs w:val="22"/>
+        </w:rPr>
+        <w:t>app</w:t>
+      </w:r>
+      <w:r>
+        <w:rPr>
+          <w:rFonts w:eastAsia="Calibri" w:cs="Calibri"/>
+          <w:i/>
+          <w:iCs/>
+          <w:szCs w:val="22"/>
+        </w:rPr>
+        <w:t>.py in the accompanying code repository.</w:t>
+      </w:r>
+    </w:p>
+    <w:p>
+      <w:pPr>
+        <w:spacing w:line="276" w:lineRule="auto"/>
       </w:pPr>
     </w:p>
     <w:p>
@@ -3120,23 +3715,7 @@
           <w:rFonts w:eastAsia="Calibri" w:cs="Calibri"/>
           <w:szCs w:val="22"/>
         </w:rPr>
-        <w:t xml:space="preserve"> </w:t>
-      </w:r>
-      <w:proofErr w:type="spellStart"/>
-      <w:r>
-        <w:rPr>
-          <w:rFonts w:eastAsia="Calibri" w:cs="Calibri"/>
-          <w:szCs w:val="22"/>
-        </w:rPr>
-        <w:t>Gradio</w:t>
-      </w:r>
-      <w:proofErr w:type="spellEnd"/>
-      <w:r>
-        <w:rPr>
-          <w:rFonts w:eastAsia="Calibri" w:cs="Calibri"/>
-          <w:szCs w:val="22"/>
-        </w:rPr>
-        <w:t xml:space="preserve"> application</w:t>
+        <w:t xml:space="preserve"> Gradio application</w:t>
       </w:r>
       <w:r>
         <w:rPr>
@@ -3190,21 +3769,7 @@
         <w:rPr>
           <w:szCs w:val="22"/>
         </w:rPr>
-        <w:t xml:space="preserve">user uploads a receipt image through the </w:t>
-      </w:r>
-      <w:proofErr w:type="spellStart"/>
-      <w:r>
-        <w:rPr>
-          <w:szCs w:val="22"/>
-        </w:rPr>
-        <w:t>Gradio</w:t>
-      </w:r>
-      <w:proofErr w:type="spellEnd"/>
-      <w:r>
-        <w:rPr>
-          <w:szCs w:val="22"/>
-        </w:rPr>
-        <w:t xml:space="preserve"> interface.</w:t>
+        <w:t>user uploads a receipt image through the Gradio interface.</w:t>
       </w:r>
     </w:p>
     <w:p>
@@ -3234,19 +3799,11 @@
         </w:rPr>
         <w:t xml:space="preserve"> – </w:t>
       </w:r>
-      <w:proofErr w:type="spellStart"/>
-      <w:r>
-        <w:rPr>
-          <w:szCs w:val="22"/>
-        </w:rPr>
-        <w:t>moondream</w:t>
-      </w:r>
-      <w:proofErr w:type="spellEnd"/>
-      <w:r>
-        <w:rPr>
-          <w:szCs w:val="22"/>
-        </w:rPr>
-        <w:t xml:space="preserve"> (the vision LLM) transcribes all visible text from the image.</w:t>
+      <w:r>
+        <w:rPr>
+          <w:szCs w:val="22"/>
+        </w:rPr>
+        <w:t>moondream (the vision LLM) transcribes all visible text from the image.</w:t>
       </w:r>
     </w:p>
     <w:p>
@@ -3302,6 +3859,7 @@
           <w:bCs/>
           <w:szCs w:val="22"/>
         </w:rPr>
+        <w:lastRenderedPageBreak/>
         <w:t>Display</w:t>
       </w:r>
       <w:r>
@@ -3382,15 +3940,7 @@
           <w:rFonts w:eastAsia="Calibri" w:cs="Calibri"/>
           <w:szCs w:val="22"/>
         </w:rPr>
-        <w:t xml:space="preserve">The offline evaluation harness reuses this exact pipeline rather than a separate script: every sampled receipt is run through all four conditions (not just the app's default </w:t>
-      </w:r>
-      <w:proofErr w:type="spellStart"/>
-      <w:r>
-        <w:rPr>
-          <w:rFonts w:eastAsia="Calibri" w:cs="Calibri"/>
-          <w:szCs w:val="22"/>
-        </w:rPr>
-        <w:t>multimodal</w:t>
+        <w:t>The offline evaluation harness reuses this exact pipeline rather than a separate script: every sampled receipt is run through all four conditions (not just the app's default multimodal</w:t>
       </w:r>
       <w:r>
         <w:rPr>
@@ -3404,15 +3954,7 @@
           <w:rFonts w:eastAsia="Calibri" w:cs="Calibri"/>
           <w:szCs w:val="22"/>
         </w:rPr>
-        <w:t>LLM</w:t>
-      </w:r>
-      <w:proofErr w:type="spellEnd"/>
-      <w:r>
-        <w:rPr>
-          <w:rFonts w:eastAsia="Calibri" w:cs="Calibri"/>
-          <w:szCs w:val="22"/>
-        </w:rPr>
-        <w:t xml:space="preserve"> path), and </w:t>
+        <w:t xml:space="preserve">LLM path), and </w:t>
       </w:r>
       <w:proofErr w:type="gramStart"/>
       <w:r>
@@ -3460,7 +4002,6 @@
         <w:pStyle w:val="Heading1"/>
       </w:pPr>
       <w:r>
-        <w:lastRenderedPageBreak/>
         <w:t xml:space="preserve">5. </w:t>
       </w:r>
       <w:r>
@@ -3600,23 +4141,7 @@
         <w:t>-</w:t>
       </w:r>
       <w:r>
-        <w:t>level similarity (</w:t>
-      </w:r>
-      <w:proofErr w:type="spellStart"/>
-      <w:r>
-        <w:t>difflib</w:t>
-      </w:r>
-      <w:proofErr w:type="spellEnd"/>
-      <w:r>
-        <w:t xml:space="preserve"> </w:t>
-      </w:r>
-      <w:proofErr w:type="spellStart"/>
-      <w:r>
-        <w:t>SequenceMatcher</w:t>
-      </w:r>
-      <w:proofErr w:type="spellEnd"/>
-      <w:r>
-        <w:t xml:space="preserve"> ratio) between prediction and ground truth, which credits close</w:t>
+        <w:t>level similarity (difflib SequenceMatcher ratio) between prediction and ground truth, which credits close</w:t>
       </w:r>
       <w:r>
         <w:t>-</w:t>
@@ -3806,23 +4331,7 @@
                 <w:sz w:val="20"/>
                 <w:szCs w:val="22"/>
               </w:rPr>
-              <w:t>Raw OCR (</w:t>
-            </w:r>
-            <w:proofErr w:type="spellStart"/>
-            <w:r>
-              <w:rPr>
-                <w:sz w:val="20"/>
-                <w:szCs w:val="22"/>
-              </w:rPr>
-              <w:t>EasyOCR</w:t>
-            </w:r>
-            <w:proofErr w:type="spellEnd"/>
-            <w:r>
-              <w:rPr>
-                <w:sz w:val="20"/>
-                <w:szCs w:val="22"/>
-              </w:rPr>
-              <w:t xml:space="preserve"> only)</w:t>
+              <w:t>Raw OCR (EasyOCR only)</w:t>
             </w:r>
           </w:p>
         </w:tc>
@@ -3992,23 +4501,7 @@
                 <w:sz w:val="20"/>
                 <w:szCs w:val="22"/>
               </w:rPr>
-              <w:t>Multimodal OCR (</w:t>
-            </w:r>
-            <w:proofErr w:type="spellStart"/>
-            <w:r>
-              <w:rPr>
-                <w:sz w:val="20"/>
-                <w:szCs w:val="22"/>
-              </w:rPr>
-              <w:t>moondream</w:t>
-            </w:r>
-            <w:proofErr w:type="spellEnd"/>
-            <w:r>
-              <w:rPr>
-                <w:sz w:val="20"/>
-                <w:szCs w:val="22"/>
-              </w:rPr>
-              <w:t xml:space="preserve"> only)</w:t>
+              <w:t>Multimodal OCR (moondream only)</w:t>
             </w:r>
           </w:p>
         </w:tc>
@@ -4221,23 +4714,15 @@
           <w:rFonts w:eastAsia="Calibri" w:cs="Calibri"/>
           <w:szCs w:val="22"/>
         </w:rPr>
-        <w:t xml:space="preserve">Both </w:t>
-      </w:r>
-      <w:proofErr w:type="spellStart"/>
-      <w:r>
-        <w:rPr>
-          <w:rFonts w:eastAsia="Calibri" w:cs="Calibri"/>
-          <w:szCs w:val="22"/>
-        </w:rPr>
-        <w:t>moondream</w:t>
-      </w:r>
-      <w:proofErr w:type="spellEnd"/>
-      <w:r>
-        <w:rPr>
-          <w:rFonts w:eastAsia="Calibri" w:cs="Calibri"/>
-          <w:szCs w:val="22"/>
-        </w:rPr>
-        <w:t>-based conditions lag well behind, even after LLM structuring: Multimodal OCR alone extracts only 29.9% of fields with near-zero exact matches, and adding the entity-analysis LLM only partially recovers this (50.6% extraction, 1.0% exact match). This reverses the original expectation that the multimodal path would be the top performer</w:t>
+        <w:t xml:space="preserve">Both moondream-based conditions lag well behind, even after LLM structuring: Multimodal OCR alone extracts only 29.9% of fields with near-zero exact matches, and adding the entity-analysis LLM only partially recovers this (50.6% extraction, 1.0% exact match). This reverses the original </w:t>
+      </w:r>
+      <w:r>
+        <w:rPr>
+          <w:rFonts w:eastAsia="Calibri" w:cs="Calibri"/>
+          <w:szCs w:val="22"/>
+        </w:rPr>
+        <w:lastRenderedPageBreak/>
+        <w:t>expectation that the multimodal path would be the top performer</w:t>
       </w:r>
       <w:r>
         <w:rPr>
@@ -4246,21 +4731,12 @@
         </w:rPr>
         <w:t xml:space="preserve">. </w:t>
       </w:r>
-      <w:proofErr w:type="spellStart"/>
-      <w:r>
-        <w:rPr>
-          <w:rFonts w:eastAsia="Calibri" w:cs="Calibri"/>
-          <w:szCs w:val="22"/>
-        </w:rPr>
-        <w:t>moondream's</w:t>
-      </w:r>
-      <w:proofErr w:type="spellEnd"/>
-      <w:r>
-        <w:rPr>
-          <w:rFonts w:eastAsia="Calibri" w:cs="Calibri"/>
-          <w:szCs w:val="22"/>
-        </w:rPr>
-        <w:t xml:space="preserve"> raw transcription quality, not the entity-extraction stage, is the bottleneck for the multimodal conditions.</w:t>
+      <w:r>
+        <w:rPr>
+          <w:rFonts w:eastAsia="Calibri" w:cs="Calibri"/>
+          <w:szCs w:val="22"/>
+        </w:rPr>
+        <w:t>moondream's raw transcription quality, not the entity-extraction stage, is the bottleneck for the multimodal conditions.</w:t>
       </w:r>
     </w:p>
     <w:p>
@@ -4331,7 +4807,6 @@
                 <w:bCs/>
                 <w:color w:val="FFFFFF" w:themeColor="background1"/>
               </w:rPr>
-              <w:lastRenderedPageBreak/>
               <w:t>Run</w:t>
             </w:r>
           </w:p>
@@ -4528,15 +5003,7 @@
     </w:tbl>
     <w:p>
       <w:r>
-        <w:t xml:space="preserve">Total cumulative wall-time across all three attempts to get all 200 receipts done: ~1,068.6 min (~17.8 hours). This total includes the debugging detours (a </w:t>
-      </w:r>
-      <w:proofErr w:type="spellStart"/>
-      <w:r>
-        <w:t>segfault</w:t>
-      </w:r>
-      <w:proofErr w:type="spellEnd"/>
-      <w:r>
-        <w:t xml:space="preserve"> and an out-of-memory issue) alongside the clean processing time — it is not a clean per-receipt benchmark.</w:t>
+        <w:t>Total cumulative wall-time across all three attempts to get all 200 receipts done: ~1,068.6 min (~17.8 hours). This total includes the debugging detours (a segfault and an out-of-memory issue) alongside the clean processing time — it is not a clean per-receipt benchmark.</w:t>
       </w:r>
     </w:p>
     <w:p>
@@ -4649,11 +5116,9 @@
             <w:pPr>
               <w:spacing w:after="80"/>
             </w:pPr>
-            <w:proofErr w:type="spellStart"/>
             <w:r>
               <w:t>raw_ocr</w:t>
             </w:r>
-            <w:proofErr w:type="spellEnd"/>
           </w:p>
         </w:tc>
         <w:tc>
@@ -4680,15 +5145,7 @@
               <w:spacing w:after="80"/>
             </w:pPr>
             <w:r>
-              <w:t>Basic OCR (</w:t>
-            </w:r>
-            <w:proofErr w:type="spellStart"/>
-            <w:r>
-              <w:t>EasyOCR</w:t>
-            </w:r>
-            <w:proofErr w:type="spellEnd"/>
-            <w:r>
-              <w:t>) only</w:t>
+              <w:t>Basic OCR (EasyOCR) only</w:t>
             </w:r>
           </w:p>
         </w:tc>
@@ -4703,11 +5160,9 @@
             <w:pPr>
               <w:spacing w:after="80"/>
             </w:pPr>
-            <w:proofErr w:type="spellStart"/>
             <w:r>
               <w:t>multimodal_ocr</w:t>
             </w:r>
-            <w:proofErr w:type="spellEnd"/>
           </w:p>
         </w:tc>
         <w:tc>
@@ -4734,15 +5189,7 @@
               <w:spacing w:after="80"/>
             </w:pPr>
             <w:r>
-              <w:t>Vision LLM (</w:t>
-            </w:r>
-            <w:proofErr w:type="spellStart"/>
-            <w:r>
-              <w:t>moondream</w:t>
-            </w:r>
-            <w:proofErr w:type="spellEnd"/>
-            <w:r>
-              <w:t>) transcription only</w:t>
+              <w:t>Vision LLM (moondream) transcription only</w:t>
             </w:r>
           </w:p>
         </w:tc>
@@ -4757,11 +5204,9 @@
             <w:pPr>
               <w:spacing w:after="80"/>
             </w:pPr>
-            <w:proofErr w:type="spellStart"/>
             <w:r>
               <w:t>multimodal_ocr_llm</w:t>
             </w:r>
-            <w:proofErr w:type="spellEnd"/>
           </w:p>
         </w:tc>
         <w:tc>
@@ -4803,11 +5248,9 @@
             <w:pPr>
               <w:spacing w:after="80"/>
             </w:pPr>
-            <w:proofErr w:type="spellStart"/>
             <w:r>
               <w:t>raw_ocr_llm</w:t>
             </w:r>
-            <w:proofErr w:type="spellEnd"/>
           </w:p>
         </w:tc>
         <w:tc>
@@ -4852,13 +5295,8 @@
           <w:numId w:val="28"/>
         </w:numPr>
       </w:pPr>
-      <w:proofErr w:type="spellStart"/>
-      <w:r>
-        <w:t>basic_ocr</w:t>
-      </w:r>
-      <w:proofErr w:type="spellEnd"/>
-      <w:r>
-        <w:t>: 44.4s avg (range 25.3–72.4s)</w:t>
+      <w:r>
+        <w:t>basic_ocr: 44.4s avg (range 25.3–72.4s)</w:t>
       </w:r>
     </w:p>
     <w:p>
@@ -4868,13 +5306,8 @@
           <w:numId w:val="28"/>
         </w:numPr>
       </w:pPr>
-      <w:proofErr w:type="spellStart"/>
-      <w:r>
-        <w:t>multimodal_ocr</w:t>
-      </w:r>
-      <w:proofErr w:type="spellEnd"/>
-      <w:r>
-        <w:t>: 86.0s avg (range 45.5–223.2s)</w:t>
+      <w:r>
+        <w:t>multimodal_ocr: 86.0s avg (range 45.5–223.2s)</w:t>
       </w:r>
     </w:p>
     <w:p>
@@ -4884,21 +5317,8 @@
           <w:numId w:val="28"/>
         </w:numPr>
       </w:pPr>
-      <w:proofErr w:type="spellStart"/>
-      <w:r>
-        <w:t>entity_extraction</w:t>
-      </w:r>
-      <w:proofErr w:type="spellEnd"/>
-      <w:r>
-        <w:t>(</w:t>
-      </w:r>
-      <w:proofErr w:type="spellStart"/>
-      <w:r>
-        <w:t>basic_text</w:t>
-      </w:r>
-      <w:proofErr w:type="spellEnd"/>
-      <w:r>
-        <w:t>): 141.7s avg (range 113.5–157.9s)</w:t>
+      <w:r>
+        <w:t>entity_extraction(basic_text): 141.7s avg (range 113.5–157.9s)</w:t>
       </w:r>
     </w:p>
     <w:p>
@@ -4908,21 +5328,8 @@
           <w:numId w:val="28"/>
         </w:numPr>
       </w:pPr>
-      <w:proofErr w:type="spellStart"/>
-      <w:r>
-        <w:t>entity_extraction</w:t>
-      </w:r>
-      <w:proofErr w:type="spellEnd"/>
-      <w:r>
-        <w:t>(</w:t>
-      </w:r>
-      <w:proofErr w:type="spellStart"/>
-      <w:r>
-        <w:t>multimodal_text</w:t>
-      </w:r>
-      <w:proofErr w:type="spellEnd"/>
-      <w:r>
-        <w:t>): 59.1s avg (range 17.0–202.8s)</w:t>
+      <w:r>
+        <w:t>entity_extraction(multimodal_text): 59.1s avg (range 17.0–202.8s)</w:t>
       </w:r>
     </w:p>
     <w:p>
@@ -4931,39 +5338,15 @@
           <w:i/>
           <w:iCs/>
         </w:rPr>
-        <w:t xml:space="preserve">Entity extraction takes over 2x longer on basic-OCR text than on vision-LLM text (141.7s vs. 59.1s). This tracks with the entity-extraction prompt's explicit instructions to rectify garbled OCR and complete truncated entities: </w:t>
-      </w:r>
-      <w:proofErr w:type="spellStart"/>
+        <w:t xml:space="preserve">Entity extraction takes over 2x longer on basic-OCR text than on vision-LLM text (141.7s vs. 59.1s). This tracks with the entity-extraction prompt's explicit instructions to rectify garbled OCR and complete truncated entities: EasyOCR's output is messier, so the LLM does more corrective work on it, while moondream's transcription is already relatively clean text requiring less fixing. The </w:t>
+      </w:r>
       <w:r>
         <w:rPr>
           <w:i/>
           <w:iCs/>
         </w:rPr>
-        <w:t>EasyOCR's</w:t>
-      </w:r>
-      <w:proofErr w:type="spellEnd"/>
-      <w:r>
-        <w:rPr>
-          <w:i/>
-          <w:iCs/>
-        </w:rPr>
-        <w:t xml:space="preserve"> output is messier, so the LLM does more corrective work on it, while </w:t>
-      </w:r>
-      <w:proofErr w:type="spellStart"/>
-      <w:r>
-        <w:rPr>
-          <w:i/>
-          <w:iCs/>
-        </w:rPr>
-        <w:t>moondream's</w:t>
-      </w:r>
-      <w:proofErr w:type="spellEnd"/>
-      <w:r>
-        <w:rPr>
-          <w:i/>
-          <w:iCs/>
-        </w:rPr>
-        <w:t xml:space="preserve"> transcription is already relatively clean text requiring less fixing. The practical implication is that the LLM post-processing step is not a fixed cost — it scales with how bad the upstream OCR was, which is worth factoring into any future latency budget.</w:t>
+        <w:lastRenderedPageBreak/>
+        <w:t>practical implication is that the LLM post-processing step is not a fixed cost — it scales with how bad the upstream OCR was, which is worth factoring into any future latency budget.</w:t>
       </w:r>
     </w:p>
     <w:p>
@@ -5016,7 +5399,6 @@
         <w:ind w:left="360" w:hanging="270"/>
       </w:pPr>
       <w:r>
-        <w:lastRenderedPageBreak/>
         <w:t xml:space="preserve">Running the </w:t>
       </w:r>
       <w:r>
@@ -5085,39 +5467,7 @@
         <w:ind w:left="360" w:hanging="270"/>
       </w:pPr>
       <w:r>
-        <w:t xml:space="preserve">The </w:t>
-      </w:r>
-      <w:proofErr w:type="spellStart"/>
-      <w:r>
-        <w:t>moondream</w:t>
-      </w:r>
-      <w:proofErr w:type="spellEnd"/>
-      <w:r>
-        <w:t>-for-</w:t>
-      </w:r>
-      <w:proofErr w:type="spellStart"/>
-      <w:r>
-        <w:t>llava</w:t>
-      </w:r>
-      <w:proofErr w:type="spellEnd"/>
-      <w:r>
-        <w:t xml:space="preserve"> substitution is a genuine engineering trade-off, not an incidental change: </w:t>
-      </w:r>
-      <w:proofErr w:type="spellStart"/>
-      <w:r>
-        <w:t>moondream</w:t>
-      </w:r>
-      <w:proofErr w:type="spellEnd"/>
-      <w:r>
-        <w:t xml:space="preserve"> trades some transcription accuracy for materially faster CPU inference, which was the right call under this project's no-paid-API, CPU-only constraint. It would be worth re-testing </w:t>
-      </w:r>
-      <w:proofErr w:type="spellStart"/>
-      <w:r>
-        <w:t>llava</w:t>
-      </w:r>
-      <w:proofErr w:type="spellEnd"/>
-      <w:r>
-        <w:t xml:space="preserve"> (or a larger vision model) if GPU inference becomes available.</w:t>
+        <w:t>The moondream-for-llava substitution is a genuine engineering trade-off, not an incidental change: moondream trades some transcription accuracy for materially faster CPU inference, which was the right call under this project's no-paid-API, CPU-only constraint. It would be worth re-testing llava (or a larger vision model) if GPU inference becomes available.</w:t>
       </w:r>
     </w:p>
     <w:p>
@@ -5245,15 +5595,7 @@
         <w:t>-</w:t>
       </w:r>
       <w:r>
-        <w:t xml:space="preserve">level confidence flags to the </w:t>
-      </w:r>
-      <w:proofErr w:type="spellStart"/>
-      <w:r>
-        <w:t>Gradio</w:t>
-      </w:r>
-      <w:proofErr w:type="spellEnd"/>
-      <w:r>
-        <w:t xml:space="preserve"> app (e.g. surfacing when </w:t>
+        <w:t xml:space="preserve">level confidence flags to the Gradio app (e.g. surfacing when </w:t>
       </w:r>
       <w:proofErr w:type="gramStart"/>
       <w:r>
@@ -5276,23 +5618,7 @@
         <w:contextualSpacing w:val="0"/>
       </w:pPr>
       <w:r>
-        <w:t xml:space="preserve">Re-benchmark </w:t>
-      </w:r>
-      <w:proofErr w:type="spellStart"/>
-      <w:r>
-        <w:t>llava</w:t>
-      </w:r>
-      <w:proofErr w:type="spellEnd"/>
-      <w:r>
-        <w:t xml:space="preserve"> against </w:t>
-      </w:r>
-      <w:proofErr w:type="spellStart"/>
-      <w:r>
-        <w:t>moondream</w:t>
-      </w:r>
-      <w:proofErr w:type="spellEnd"/>
-      <w:r>
-        <w:t xml:space="preserve"> if GPU inference becomes available, to quantify the CPU-speed-vs-accuracy trade-off more precisely rather than qualitatively.</w:t>
+        <w:t>Re-benchmark llava against moondream if GPU inference becomes available, to quantify the CPU-speed-vs-accuracy trade-off more precisely rather than qualitatively.</w:t>
       </w:r>
     </w:p>
     <w:p>
@@ -5308,6 +5634,7 @@
         <w:pStyle w:val="Heading1"/>
       </w:pPr>
       <w:r>
+        <w:lastRenderedPageBreak/>
         <w:t>6</w:t>
       </w:r>
       <w:r>
@@ -5369,7 +5696,7 @@
         <w:spacing w:after="80" w:line="276" w:lineRule="auto"/>
         <w:contextualSpacing w:val="0"/>
       </w:pPr>
-      <w:hyperlink r:id="rId5" w:history="1">
+      <w:hyperlink r:id="rId6" w:history="1">
         <w:r>
           <w:rPr>
             <w:rStyle w:val="Hyperlink"/>
@@ -5394,29 +5721,8 @@
         <w:spacing w:after="80" w:line="276" w:lineRule="auto"/>
         <w:contextualSpacing w:val="0"/>
       </w:pPr>
-      <w:proofErr w:type="spellStart"/>
-      <w:r>
-        <w:t>EasyOCR</w:t>
-      </w:r>
-      <w:proofErr w:type="spellEnd"/>
-      <w:r>
-        <w:t xml:space="preserve">, </w:t>
-      </w:r>
-      <w:proofErr w:type="spellStart"/>
-      <w:r>
-        <w:t>Ollama</w:t>
-      </w:r>
-      <w:proofErr w:type="spellEnd"/>
-      <w:r>
-        <w:t xml:space="preserve">, and </w:t>
-      </w:r>
-      <w:proofErr w:type="spellStart"/>
-      <w:r>
-        <w:t>Gradio</w:t>
-      </w:r>
-      <w:proofErr w:type="spellEnd"/>
-      <w:r>
-        <w:t xml:space="preserve"> official documentation</w:t>
+      <w:r>
+        <w:t>EasyOCR, Ollama, and Gradio official documentation</w:t>
       </w:r>
       <w:r>
         <w:t xml:space="preserve"> </w:t>
@@ -5443,7 +5749,6 @@
         <w:pStyle w:val="Heading2"/>
       </w:pPr>
       <w:r>
-        <w:lastRenderedPageBreak/>
         <w:t>6</w:t>
       </w:r>
       <w:r>
@@ -5466,7 +5771,6 @@
         <w:spacing w:after="80" w:line="276" w:lineRule="auto"/>
         <w:contextualSpacing w:val="0"/>
       </w:pPr>
-      <w:proofErr w:type="spellStart"/>
       <w:r>
         <w:rPr>
           <w:b/>
@@ -5474,7 +5778,6 @@
         </w:rPr>
         <w:t>moondream</w:t>
       </w:r>
-      <w:proofErr w:type="spellEnd"/>
       <w:r>
         <w:t xml:space="preserve"> – </w:t>
       </w:r>
@@ -5485,15 +5788,7 @@
         <w:t>-</w:t>
       </w:r>
       <w:r>
-        <w:t xml:space="preserve">language model, served via </w:t>
-      </w:r>
-      <w:proofErr w:type="spellStart"/>
-      <w:r>
-        <w:t>Ollama</w:t>
-      </w:r>
-      <w:proofErr w:type="spellEnd"/>
-      <w:r>
-        <w:t>, used for multimodal OCR.</w:t>
+        <w:t>language model, served via Ollama, used for multimodal OCR.</w:t>
       </w:r>
     </w:p>
     <w:p>
@@ -5517,23 +5812,7 @@
         <w:t xml:space="preserve"> – </w:t>
       </w:r>
       <w:r>
-        <w:t xml:space="preserve">local text LLM, served via </w:t>
-      </w:r>
-      <w:proofErr w:type="spellStart"/>
-      <w:r>
-        <w:t>Ollama</w:t>
-      </w:r>
-      <w:proofErr w:type="spellEnd"/>
-      <w:r>
-        <w:t xml:space="preserve">, used for entity extraction/correction and for the </w:t>
-      </w:r>
-      <w:proofErr w:type="spellStart"/>
-      <w:r>
-        <w:t>Gradio</w:t>
-      </w:r>
-      <w:proofErr w:type="spellEnd"/>
-      <w:r>
-        <w:t xml:space="preserve"> app's Q&amp;A responses.</w:t>
+        <w:t>local text LLM, served via Ollama, used for entity extraction/correction and for the Gradio app's Q&amp;A responses.</w:t>
       </w:r>
     </w:p>
     <w:p>
@@ -5746,27 +6025,7 @@
                 <w:sz w:val="18"/>
                 <w:szCs w:val="18"/>
               </w:rPr>
-              <w:t>ocr_basic.py           Basic OCR engine wrapper (</w:t>
-            </w:r>
-            <w:proofErr w:type="spellStart"/>
-            <w:r>
-              <w:rPr>
-                <w:rFonts w:ascii="Courier New" w:eastAsia="Courier New" w:hAnsi="Courier New" w:cs="Courier New"/>
-                <w:color w:val="222222"/>
-                <w:sz w:val="18"/>
-                <w:szCs w:val="18"/>
-              </w:rPr>
-              <w:t>EasyOCR</w:t>
-            </w:r>
-            <w:proofErr w:type="spellEnd"/>
-            <w:r>
-              <w:rPr>
-                <w:rFonts w:ascii="Courier New" w:eastAsia="Courier New" w:hAnsi="Courier New" w:cs="Courier New"/>
-                <w:color w:val="222222"/>
-                <w:sz w:val="18"/>
-                <w:szCs w:val="18"/>
-              </w:rPr>
-              <w:t>)</w:t>
+              <w:t>ocr_basic.py           Basic OCR engine wrapper (EasyOCR)</w:t>
             </w:r>
             <w:r>
               <w:br/>
@@ -5796,47 +6055,7 @@
                 <w:sz w:val="18"/>
                 <w:szCs w:val="18"/>
               </w:rPr>
-              <w:t>LLM OCR wrapper (</w:t>
-            </w:r>
-            <w:proofErr w:type="spellStart"/>
-            <w:r>
-              <w:rPr>
-                <w:rFonts w:ascii="Courier New" w:eastAsia="Courier New" w:hAnsi="Courier New" w:cs="Courier New"/>
-                <w:color w:val="222222"/>
-                <w:sz w:val="18"/>
-                <w:szCs w:val="18"/>
-              </w:rPr>
-              <w:t>moondream</w:t>
-            </w:r>
-            <w:proofErr w:type="spellEnd"/>
-            <w:r>
-              <w:rPr>
-                <w:rFonts w:ascii="Courier New" w:eastAsia="Courier New" w:hAnsi="Courier New" w:cs="Courier New"/>
-                <w:color w:val="222222"/>
-                <w:sz w:val="18"/>
-                <w:szCs w:val="18"/>
-              </w:rPr>
-              <w:t xml:space="preserve"> via </w:t>
-            </w:r>
-            <w:proofErr w:type="spellStart"/>
-            <w:r>
-              <w:rPr>
-                <w:rFonts w:ascii="Courier New" w:eastAsia="Courier New" w:hAnsi="Courier New" w:cs="Courier New"/>
-                <w:color w:val="222222"/>
-                <w:sz w:val="18"/>
-                <w:szCs w:val="18"/>
-              </w:rPr>
-              <w:t>Ollama</w:t>
-            </w:r>
-            <w:proofErr w:type="spellEnd"/>
-            <w:r>
-              <w:rPr>
-                <w:rFonts w:ascii="Courier New" w:eastAsia="Courier New" w:hAnsi="Courier New" w:cs="Courier New"/>
-                <w:color w:val="222222"/>
-                <w:sz w:val="18"/>
-                <w:szCs w:val="18"/>
-              </w:rPr>
-              <w:t>)</w:t>
+              <w:t>LLM OCR wrapper (moondream via Ollama)</w:t>
             </w:r>
             <w:r>
               <w:br/>
@@ -5914,27 +6133,7 @@
                 <w:sz w:val="18"/>
                 <w:szCs w:val="18"/>
               </w:rPr>
-              <w:t xml:space="preserve">app.py                 </w:t>
-            </w:r>
-            <w:proofErr w:type="spellStart"/>
-            <w:r>
-              <w:rPr>
-                <w:rFonts w:ascii="Courier New" w:eastAsia="Courier New" w:hAnsi="Courier New" w:cs="Courier New"/>
-                <w:color w:val="222222"/>
-                <w:sz w:val="18"/>
-                <w:szCs w:val="18"/>
-              </w:rPr>
-              <w:t>Gradio</w:t>
-            </w:r>
-            <w:proofErr w:type="spellEnd"/>
-            <w:r>
-              <w:rPr>
-                <w:rFonts w:ascii="Courier New" w:eastAsia="Courier New" w:hAnsi="Courier New" w:cs="Courier New"/>
-                <w:color w:val="222222"/>
-                <w:sz w:val="18"/>
-                <w:szCs w:val="18"/>
-              </w:rPr>
-              <w:t xml:space="preserve"> demo app (upload + Q&amp;A)</w:t>
+              <w:t>app.py                 Gradio demo app (upload + Q&amp;A)</w:t>
             </w:r>
             <w:r>
               <w:br/>
@@ -6019,15 +6218,7 @@
         <w:t>-</w:t>
       </w:r>
       <w:r>
-        <w:t xml:space="preserve">extraction prompt, evaluation harness, </w:t>
-      </w:r>
-      <w:proofErr w:type="spellStart"/>
-      <w:r>
-        <w:t>Gradio</w:t>
-      </w:r>
-      <w:proofErr w:type="spellEnd"/>
-      <w:r>
-        <w:t xml:space="preserve"> app), drafting the entity</w:t>
+        <w:t>extraction prompt, evaluation harness, Gradio app), drafting the entity</w:t>
       </w:r>
       <w:r>
         <w:t>-</w:t>
@@ -6047,6 +6238,7 @@
         <w:contextualSpacing w:val="0"/>
       </w:pPr>
       <w:r>
+        <w:lastRenderedPageBreak/>
         <w:t>All AI</w:t>
       </w:r>
       <w:r>
@@ -9131,7 +9323,6 @@
   <w:style w:type="character" w:default="1" w:styleId="DefaultParagraphFont">
     <w:name w:val="Default Paragraph Font"/>
     <w:uiPriority w:val="1"/>
-    <w:semiHidden/>
     <w:unhideWhenUsed/>
   </w:style>
   <w:style w:type="table" w:default="1" w:styleId="TableNormal">

</xml_diff>